<commit_message>
Portfolio: add five AI-built apps, AI builder framing, fix catfish farm role
- New "More builds" section: CMV AlphaScanner, MacroSentinel, DCA Simulator,
  Bitcoin Battlefield and Banger Studio, with screenshots
- Catfish farm described as an owner-operated business on rented ponds at
  Samalad Farm, not a founded farm
- CV (web, PDF, Word) updated: Founder & AI Product Builder role, all eight
  products with links, AI skills, farm correction; still two pages

Co-Authored-By: Claude Opus 5.5 <noreply@anthropic.com>
Claude-Session: https://claude.ai/code/session_01RQARRjvZbGkqL6S5F9kfaq
</commit_message>
<xml_diff>
--- a/portfolio/cv/Victor-Bukola-Ojumu-CV.docx
+++ b/portfolio/cv/Victor-Bukola-Ojumu-CV.docx
@@ -67,7 +67,7 @@
                 <w:sz w:val="17"/>
                 <w:szCs w:val="17"/>
               </w:rPr>
-              <w:t xml:space="preserve">ARTIST · TRADER · PRODUCT BUILDER · OPERATIONS &amp; SALES</w:t>
+              <w:t xml:space="preserve">ARTIST · TRADER · AI PRODUCT BUILDER · OPERATIONS &amp; SALES</w:t>
             </w:r>
           </w:p>
           <w:p>
@@ -83,7 +83,7 @@
               </w:rPr>
               <w:t xml:space="preserve">Lagos, Nigeria  ·  </w:t>
             </w:r>
-            <w:hyperlink w:history="1" r:id="rIdtum_kmsxnzjj9hi-uy4ip">
+            <w:hyperlink w:history="1" r:id="rIdpwrmjo0coyc-dle0bfd46">
               <w:r>
                 <w:rPr>
                   <w:rFonts w:ascii="Calibri" w:cs="Calibri" w:eastAsia="Calibri" w:hAnsi="Calibri"/>
@@ -100,7 +100,7 @@
             <w:pPr>
               <w:spacing w:after="0"/>
             </w:pPr>
-            <w:hyperlink w:history="1" r:id="rIdvks585f9q1bomeiyqqnah">
+            <w:hyperlink w:history="1" r:id="rIdcntprarx4-8nuj-mmtip4">
               <w:r>
                 <w:rPr>
                   <w:rFonts w:ascii="Calibri" w:cs="Calibri" w:eastAsia="Calibri" w:hAnsi="Calibri"/>
@@ -121,7 +121,7 @@
               </w:rPr>
               <w:t xml:space="preserve">  ·  </w:t>
             </w:r>
-            <w:hyperlink w:history="1" r:id="rIdv9ciuqeii0m9r2nntbsvd">
+            <w:hyperlink w:history="1" r:id="rIdrgc9hb1nb9n-7coxsthbt">
               <w:r>
                 <w:rPr>
                   <w:rFonts w:ascii="Calibri" w:cs="Calibri" w:eastAsia="Calibri" w:hAnsi="Calibri"/>
@@ -142,7 +142,7 @@
               </w:rPr>
               <w:t xml:space="preserve">  ·  </w:t>
             </w:r>
-            <w:hyperlink w:history="1" r:id="rIdjiw-idr4duhxzrbstgbdb">
+            <w:hyperlink w:history="1" r:id="rId_ednjcmyktqpwiw6datjr">
               <w:r>
                 <w:rPr>
                   <w:rFonts w:ascii="Calibri" w:cs="Calibri" w:eastAsia="Calibri" w:hAnsi="Calibri"/>
@@ -217,10 +217,11 @@
     </w:tbl>
     <w:p>
       <w:pPr>
+        <w:keepNext/>
         <w:pBdr>
           <w:bottom w:val="single" w:color="D5DAE3" w:sz="6" w:space="3"/>
         </w:pBdr>
-        <w:spacing w:after="100" w:before="260"/>
+        <w:spacing w:after="90" w:before="220"/>
       </w:pPr>
       <w:r>
         <w:rPr>
@@ -246,15 +247,16 @@
           <w:sz w:val="20"/>
           <w:szCs w:val="20"/>
         </w:rPr>
-        <w:t xml:space="preserve">Multidisciplinary operator, artist and product builder based in Lagos, Nigeria. Managed inventory, sales records and an eight-person team at a car dealership; founded and ran a 10-pond commercial catfish farm; ran outdoor charcoal barbecue cooking for two years; and has traded forex and crypto markets since 2019. A self-taught graphite and charcoal artist with two collections on OpenSea, and the builder of live web products, including an AI football-prediction platform and an automated forex and crypto signal bot. Civil Engineering graduate of the Federal University Oye-Ekiti.</w:t>
-      </w:r>
-    </w:p>
-    <w:p>
-      <w:pPr>
+        <w:t xml:space="preserve">Multidisciplinary operator, artist and AI product builder based in Lagos, Nigeria. Uses AI tools such as Claude and ChatGPT to design and ship web products, with eight live in about five months, including an AI football-prediction platform and an automated forex and crypto signal bot. Managed inventory, sales records and an eight-person team at a car dealership; ran an independent catfish farming business on ten rented ponds for three years; ran outdoor charcoal barbecue cooking for two years; and has traded forex and crypto markets since 2019. A self-taught graphite and charcoal artist with two collections on OpenSea, and a Civil Engineering graduate of the Federal University Oye-Ekiti.</w:t>
+      </w:r>
+    </w:p>
+    <w:p>
+      <w:pPr>
+        <w:keepNext/>
         <w:pBdr>
           <w:bottom w:val="single" w:color="D5DAE3" w:sz="6" w:space="3"/>
         </w:pBdr>
-        <w:spacing w:after="100" w:before="260"/>
+        <w:spacing w:after="90" w:before="220"/>
       </w:pPr>
       <w:r>
         <w:rPr>
@@ -271,6 +273,7 @@
     </w:p>
     <w:p>
       <w:pPr>
+        <w:keepNext/>
         <w:tabs>
           <w:tab w:val="right" w:pos="9890"/>
         </w:tabs>
@@ -285,7 +288,7 @@
           <w:sz w:val="22"/>
           <w:szCs w:val="22"/>
         </w:rPr>
-        <w:t xml:space="preserve">Founder &amp; Product Builder</w:t>
+        <w:t xml:space="preserve">Founder &amp; AI Product Builder</w:t>
       </w:r>
       <w:r>
         <w:rPr>
@@ -301,6 +304,7 @@
     </w:p>
     <w:p>
       <w:pPr>
+        <w:keepNext/>
         <w:spacing w:after="60"/>
       </w:pPr>
       <w:r>
@@ -329,27 +333,7 @@
           <w:sz w:val="20"/>
           <w:szCs w:val="20"/>
         </w:rPr>
-        <w:t xml:space="preserve">Designed, built and launched </w:t>
-      </w:r>
-      <w:r>
-        <w:rPr>
-          <w:rFonts w:ascii="Calibri" w:cs="Calibri" w:eastAsia="Calibri" w:hAnsi="Calibri"/>
-          <w:b/>
-          <w:bCs/>
-          <w:color w:val="0E1116"/>
-          <w:sz w:val="20"/>
-          <w:szCs w:val="20"/>
-        </w:rPr>
-        <w:t xml:space="preserve">cmvngpicks.com</w:t>
-      </w:r>
-      <w:r>
-        <w:rPr>
-          <w:rFonts w:ascii="Calibri" w:cs="Calibri" w:eastAsia="Calibri" w:hAnsi="Calibri"/>
-          <w:color w:val="3A4150"/>
-          <w:sz w:val="20"/>
-          <w:szCs w:val="20"/>
-        </w:rPr>
-        <w:t xml:space="preserve">, an AI-powered football prediction platform that ranks fixtures by win probability, publishes daily accumulator slips with one-tap booking codes, and grades every pick in public.</w:t>
+        <w:t xml:space="preserve">Explores and applies AI tools, including Claude and ChatGPT, to design, build and ship web products: eight live in about five months, with a current focus on prediction websites and trading bots.</w:t>
       </w:r>
     </w:p>
     <w:p>
@@ -368,27 +352,27 @@
           <w:sz w:val="20"/>
           <w:szCs w:val="20"/>
         </w:rPr>
-        <w:t xml:space="preserve">Built </w:t>
-      </w:r>
-      <w:r>
-        <w:rPr>
-          <w:rFonts w:ascii="Calibri" w:cs="Calibri" w:eastAsia="Calibri" w:hAnsi="Calibri"/>
-          <w:b/>
-          <w:bCs/>
-          <w:color w:val="0E1116"/>
-          <w:sz w:val="20"/>
-          <w:szCs w:val="20"/>
-        </w:rPr>
-        <w:t xml:space="preserve">cmvngsignals.com</w:t>
-      </w:r>
-      <w:r>
-        <w:rPr>
-          <w:rFonts w:ascii="Calibri" w:cs="Calibri" w:eastAsia="Calibri" w:hAnsi="Calibri"/>
-          <w:color w:val="3A4150"/>
-          <w:sz w:val="20"/>
-          <w:szCs w:val="20"/>
-        </w:rPr>
-        <w:t xml:space="preserve">, an automated forex and crypto signal bot that scans pairs across timeframes, sets entry, stop-loss and take-profit levels, and tracks every result on a live dashboard (currently paper trading).</w:t>
+        <w:t xml:space="preserve">Designed, built and launched </w:t>
+      </w:r>
+      <w:r>
+        <w:rPr>
+          <w:rFonts w:ascii="Calibri" w:cs="Calibri" w:eastAsia="Calibri" w:hAnsi="Calibri"/>
+          <w:b/>
+          <w:bCs/>
+          <w:color w:val="0E1116"/>
+          <w:sz w:val="20"/>
+          <w:szCs w:val="20"/>
+        </w:rPr>
+        <w:t xml:space="preserve">cmvngpicks.com</w:t>
+      </w:r>
+      <w:r>
+        <w:rPr>
+          <w:rFonts w:ascii="Calibri" w:cs="Calibri" w:eastAsia="Calibri" w:hAnsi="Calibri"/>
+          <w:color w:val="3A4150"/>
+          <w:sz w:val="20"/>
+          <w:szCs w:val="20"/>
+        </w:rPr>
+        <w:t xml:space="preserve">, an AI-powered football prediction platform that ranks fixtures by win probability, publishes daily accumulator slips with one-tap booking codes, and grades every pick in public.</w:t>
       </w:r>
     </w:p>
     <w:p>
@@ -407,71 +391,27 @@
           <w:sz w:val="20"/>
           <w:szCs w:val="20"/>
         </w:rPr>
-        <w:t xml:space="preserve">Launched the </w:t>
-      </w:r>
-      <w:r>
-        <w:rPr>
-          <w:rFonts w:ascii="Calibri" w:cs="Calibri" w:eastAsia="Calibri" w:hAnsi="Calibri"/>
-          <w:b/>
-          <w:bCs/>
-          <w:color w:val="0E1116"/>
-          <w:sz w:val="20"/>
-          <w:szCs w:val="20"/>
-        </w:rPr>
-        <w:t xml:space="preserve">CMVNG Art Gallery</w:t>
-      </w:r>
-      <w:r>
-        <w:rPr>
-          <w:rFonts w:ascii="Calibri" w:cs="Calibri" w:eastAsia="Calibri" w:hAnsi="Calibri"/>
-          <w:color w:val="3A4150"/>
-          <w:sz w:val="20"/>
-          <w:szCs w:val="20"/>
-        </w:rPr>
-        <w:t xml:space="preserve">, an online portfolio with a mobile studio for publishing new and in-progress artworks.</w:t>
-      </w:r>
-    </w:p>
-    <w:p>
-      <w:pPr>
-        <w:tabs>
-          <w:tab w:val="right" w:pos="9890"/>
-        </w:tabs>
-        <w:spacing w:after="0" w:before="140"/>
-      </w:pPr>
-      <w:r>
-        <w:rPr>
-          <w:rFonts w:ascii="Calibri" w:cs="Calibri" w:eastAsia="Calibri" w:hAnsi="Calibri"/>
-          <w:b/>
-          <w:bCs/>
-          <w:color w:val="0E1116"/>
-          <w:sz w:val="22"/>
-          <w:szCs w:val="22"/>
-        </w:rPr>
-        <w:t xml:space="preserve">Forex &amp; Crypto Trader</w:t>
-      </w:r>
-      <w:r>
-        <w:rPr>
-          <w:rFonts w:ascii="Calibri" w:cs="Calibri" w:eastAsia="Calibri" w:hAnsi="Calibri"/>
-          <w:b/>
-          <w:bCs/>
-          <w:color w:val="6B7383"/>
-          <w:sz w:val="18"/>
-          <w:szCs w:val="18"/>
-        </w:rPr>
-        <w:t xml:space="preserve">	2019 – Present</w:t>
-      </w:r>
-    </w:p>
-    <w:p>
-      <w:pPr>
-        <w:spacing w:after="60"/>
-      </w:pPr>
-      <w:r>
-        <w:rPr>
-          <w:rFonts w:ascii="Calibri" w:cs="Calibri" w:eastAsia="Calibri" w:hAnsi="Calibri"/>
-          <w:color w:val="2F63E0"/>
-          <w:sz w:val="19"/>
-          <w:szCs w:val="19"/>
-        </w:rPr>
-        <w:t xml:space="preserve">Independent</w:t>
+        <w:t xml:space="preserve">Built </w:t>
+      </w:r>
+      <w:r>
+        <w:rPr>
+          <w:rFonts w:ascii="Calibri" w:cs="Calibri" w:eastAsia="Calibri" w:hAnsi="Calibri"/>
+          <w:b/>
+          <w:bCs/>
+          <w:color w:val="0E1116"/>
+          <w:sz w:val="20"/>
+          <w:szCs w:val="20"/>
+        </w:rPr>
+        <w:t xml:space="preserve">cmvngsignals.com</w:t>
+      </w:r>
+      <w:r>
+        <w:rPr>
+          <w:rFonts w:ascii="Calibri" w:cs="Calibri" w:eastAsia="Calibri" w:hAnsi="Calibri"/>
+          <w:color w:val="3A4150"/>
+          <w:sz w:val="20"/>
+          <w:szCs w:val="20"/>
+        </w:rPr>
+        <w:t xml:space="preserve">, an automated forex and crypto signal bot that sets entry, stop-loss and take-profit levels and tracks every result on a live dashboard (currently paper trading).</w:t>
       </w:r>
     </w:p>
     <w:p>
@@ -490,7 +430,107 @@
           <w:sz w:val="20"/>
           <w:szCs w:val="20"/>
         </w:rPr>
-        <w:t xml:space="preserve">Trades forex majors and minors and cryptocurrencies, with a primary focus on Bitcoin.</w:t>
+        <w:t xml:space="preserve">Built </w:t>
+      </w:r>
+      <w:r>
+        <w:rPr>
+          <w:rFonts w:ascii="Calibri" w:cs="Calibri" w:eastAsia="Calibri" w:hAnsi="Calibri"/>
+          <w:b/>
+          <w:bCs/>
+          <w:color w:val="0E1116"/>
+          <w:sz w:val="20"/>
+          <w:szCs w:val="20"/>
+        </w:rPr>
+        <w:t xml:space="preserve">CMV AlphaScanner</w:t>
+      </w:r>
+      <w:r>
+        <w:rPr>
+          <w:rFonts w:ascii="Calibri" w:cs="Calibri" w:eastAsia="Calibri" w:hAnsi="Calibri"/>
+          <w:color w:val="3A4150"/>
+          <w:sz w:val="20"/>
+          <w:szCs w:val="20"/>
+        </w:rPr>
+        <w:t xml:space="preserve"> (AI red-flag scanner for crypto projects), </w:t>
+      </w:r>
+      <w:r>
+        <w:rPr>
+          <w:rFonts w:ascii="Calibri" w:cs="Calibri" w:eastAsia="Calibri" w:hAnsi="Calibri"/>
+          <w:b/>
+          <w:bCs/>
+          <w:color w:val="0E1116"/>
+          <w:sz w:val="20"/>
+          <w:szCs w:val="20"/>
+        </w:rPr>
+        <w:t xml:space="preserve">MacroSentinel</w:t>
+      </w:r>
+      <w:r>
+        <w:rPr>
+          <w:rFonts w:ascii="Calibri" w:cs="Calibri" w:eastAsia="Calibri" w:hAnsi="Calibri"/>
+          <w:color w:val="3A4150"/>
+          <w:sz w:val="20"/>
+          <w:szCs w:val="20"/>
+        </w:rPr>
+        <w:t xml:space="preserve"> (macro sentiment dashboard), a crypto </w:t>
+      </w:r>
+      <w:r>
+        <w:rPr>
+          <w:rFonts w:ascii="Calibri" w:cs="Calibri" w:eastAsia="Calibri" w:hAnsi="Calibri"/>
+          <w:b/>
+          <w:bCs/>
+          <w:color w:val="0E1116"/>
+          <w:sz w:val="20"/>
+          <w:szCs w:val="20"/>
+        </w:rPr>
+        <w:t xml:space="preserve">DCA Simulator</w:t>
+      </w:r>
+      <w:r>
+        <w:rPr>
+          <w:rFonts w:ascii="Calibri" w:cs="Calibri" w:eastAsia="Calibri" w:hAnsi="Calibri"/>
+          <w:color w:val="3A4150"/>
+          <w:sz w:val="20"/>
+          <w:szCs w:val="20"/>
+        </w:rPr>
+        <w:t xml:space="preserve">, </w:t>
+      </w:r>
+      <w:r>
+        <w:rPr>
+          <w:rFonts w:ascii="Calibri" w:cs="Calibri" w:eastAsia="Calibri" w:hAnsi="Calibri"/>
+          <w:b/>
+          <w:bCs/>
+          <w:color w:val="0E1116"/>
+          <w:sz w:val="20"/>
+          <w:szCs w:val="20"/>
+        </w:rPr>
+        <w:t xml:space="preserve">Bitcoin Battlefield</w:t>
+      </w:r>
+      <w:r>
+        <w:rPr>
+          <w:rFonts w:ascii="Calibri" w:cs="Calibri" w:eastAsia="Calibri" w:hAnsi="Calibri"/>
+          <w:color w:val="3A4150"/>
+          <w:sz w:val="20"/>
+          <w:szCs w:val="20"/>
+        </w:rPr>
+        <w:t xml:space="preserve"> (3D strategy game driven by the Bitcoin price) and </w:t>
+      </w:r>
+      <w:r>
+        <w:rPr>
+          <w:rFonts w:ascii="Calibri" w:cs="Calibri" w:eastAsia="Calibri" w:hAnsi="Calibri"/>
+          <w:b/>
+          <w:bCs/>
+          <w:color w:val="0E1116"/>
+          <w:sz w:val="20"/>
+          <w:szCs w:val="20"/>
+        </w:rPr>
+        <w:t xml:space="preserve">Banger Studio</w:t>
+      </w:r>
+      <w:r>
+        <w:rPr>
+          <w:rFonts w:ascii="Calibri" w:cs="Calibri" w:eastAsia="Calibri" w:hAnsi="Calibri"/>
+          <w:color w:val="3A4150"/>
+          <w:sz w:val="20"/>
+          <w:szCs w:val="20"/>
+        </w:rPr>
+        <w:t xml:space="preserve"> (AI content studio).</w:t>
       </w:r>
     </w:p>
     <w:p>
@@ -509,7 +549,73 @@
           <w:sz w:val="20"/>
           <w:szCs w:val="20"/>
         </w:rPr>
-        <w:t xml:space="preserve">Shares market views and trade ideas with followers through a Telegram channel.</w:t>
+        <w:t xml:space="preserve">Launched the </w:t>
+      </w:r>
+      <w:r>
+        <w:rPr>
+          <w:rFonts w:ascii="Calibri" w:cs="Calibri" w:eastAsia="Calibri" w:hAnsi="Calibri"/>
+          <w:b/>
+          <w:bCs/>
+          <w:color w:val="0E1116"/>
+          <w:sz w:val="20"/>
+          <w:szCs w:val="20"/>
+        </w:rPr>
+        <w:t xml:space="preserve">CMVNG Art Gallery</w:t>
+      </w:r>
+      <w:r>
+        <w:rPr>
+          <w:rFonts w:ascii="Calibri" w:cs="Calibri" w:eastAsia="Calibri" w:hAnsi="Calibri"/>
+          <w:color w:val="3A4150"/>
+          <w:sz w:val="20"/>
+          <w:szCs w:val="20"/>
+        </w:rPr>
+        <w:t xml:space="preserve">, an online portfolio with a mobile studio for publishing new and in-progress artworks.</w:t>
+      </w:r>
+    </w:p>
+    <w:p>
+      <w:pPr>
+        <w:keepNext/>
+        <w:tabs>
+          <w:tab w:val="right" w:pos="9890"/>
+        </w:tabs>
+        <w:spacing w:after="0" w:before="140"/>
+      </w:pPr>
+      <w:r>
+        <w:rPr>
+          <w:rFonts w:ascii="Calibri" w:cs="Calibri" w:eastAsia="Calibri" w:hAnsi="Calibri"/>
+          <w:b/>
+          <w:bCs/>
+          <w:color w:val="0E1116"/>
+          <w:sz w:val="22"/>
+          <w:szCs w:val="22"/>
+        </w:rPr>
+        <w:t xml:space="preserve">Forex &amp; Crypto Trader</w:t>
+      </w:r>
+      <w:r>
+        <w:rPr>
+          <w:rFonts w:ascii="Calibri" w:cs="Calibri" w:eastAsia="Calibri" w:hAnsi="Calibri"/>
+          <w:b/>
+          <w:bCs/>
+          <w:color w:val="6B7383"/>
+          <w:sz w:val="18"/>
+          <w:szCs w:val="18"/>
+        </w:rPr>
+        <w:t xml:space="preserve">	2019 – Present</w:t>
+      </w:r>
+    </w:p>
+    <w:p>
+      <w:pPr>
+        <w:keepNext/>
+        <w:spacing w:after="60"/>
+      </w:pPr>
+      <w:r>
+        <w:rPr>
+          <w:rFonts w:ascii="Calibri" w:cs="Calibri" w:eastAsia="Calibri" w:hAnsi="Calibri"/>
+          <w:color w:val="2F63E0"/>
+          <w:sz w:val="19"/>
+          <w:szCs w:val="19"/>
+        </w:rPr>
+        <w:t xml:space="preserve">Independent</w:t>
       </w:r>
     </w:p>
     <w:p>
@@ -528,40 +634,7 @@
           <w:sz w:val="20"/>
           <w:szCs w:val="20"/>
         </w:rPr>
-        <w:t xml:space="preserve">Turned a manual trading approach into software by building an automated signal bot.</w:t>
-      </w:r>
-    </w:p>
-    <w:p>
-      <w:pPr>
-        <w:tabs>
-          <w:tab w:val="right" w:pos="9890"/>
-        </w:tabs>
-        <w:spacing w:after="0" w:before="140"/>
-      </w:pPr>
-      <w:r>
-        <w:rPr>
-          <w:rFonts w:ascii="Calibri" w:cs="Calibri" w:eastAsia="Calibri" w:hAnsi="Calibri"/>
-          <w:b/>
-          <w:bCs/>
-          <w:color w:val="0E1116"/>
-          <w:sz w:val="22"/>
-          <w:szCs w:val="22"/>
-        </w:rPr>
-        <w:t xml:space="preserve">Inventory Manager &amp; General Manager</w:t>
-      </w:r>
-    </w:p>
-    <w:p>
-      <w:pPr>
-        <w:spacing w:after="60"/>
-      </w:pPr>
-      <w:r>
-        <w:rPr>
-          <w:rFonts w:ascii="Calibri" w:cs="Calibri" w:eastAsia="Calibri" w:hAnsi="Calibri"/>
-          <w:color w:val="2F63E0"/>
-          <w:sz w:val="19"/>
-          <w:szCs w:val="19"/>
-        </w:rPr>
-        <w:t xml:space="preserve">Showboy Motors · Car dealership</w:t>
+        <w:t xml:space="preserve">Trades forex majors and minors and cryptocurrencies, with a primary focus on Bitcoin.</w:t>
       </w:r>
     </w:p>
     <w:p>
@@ -580,7 +653,7 @@
           <w:sz w:val="20"/>
           <w:szCs w:val="20"/>
         </w:rPr>
-        <w:t xml:space="preserve">Ran inventory control for the dealership, recording every car part received and tracking each vehicle moving out for inspection, repairs and painting.</w:t>
+        <w:t xml:space="preserve">Shares market views and trade ideas with followers through a Telegram channel.</w:t>
       </w:r>
     </w:p>
     <w:p>
@@ -599,7 +672,42 @@
           <w:sz w:val="20"/>
           <w:szCs w:val="20"/>
         </w:rPr>
-        <w:t xml:space="preserve">Kept the full sales record for every car sold, tracking each vehicle from import cost to sale price, with profit margins and losses.</w:t>
+        <w:t xml:space="preserve">Turned a manual trading approach into software by building an automated signal bot.</w:t>
+      </w:r>
+    </w:p>
+    <w:p>
+      <w:pPr>
+        <w:keepNext/>
+        <w:tabs>
+          <w:tab w:val="right" w:pos="9890"/>
+        </w:tabs>
+        <w:spacing w:after="0" w:before="140"/>
+      </w:pPr>
+      <w:r>
+        <w:rPr>
+          <w:rFonts w:ascii="Calibri" w:cs="Calibri" w:eastAsia="Calibri" w:hAnsi="Calibri"/>
+          <w:b/>
+          <w:bCs/>
+          <w:color w:val="0E1116"/>
+          <w:sz w:val="22"/>
+          <w:szCs w:val="22"/>
+        </w:rPr>
+        <w:t xml:space="preserve">Inventory Manager &amp; General Manager</w:t>
+      </w:r>
+    </w:p>
+    <w:p>
+      <w:pPr>
+        <w:keepNext/>
+        <w:spacing w:after="60"/>
+      </w:pPr>
+      <w:r>
+        <w:rPr>
+          <w:rFonts w:ascii="Calibri" w:cs="Calibri" w:eastAsia="Calibri" w:hAnsi="Calibri"/>
+          <w:color w:val="2F63E0"/>
+          <w:sz w:val="19"/>
+          <w:szCs w:val="19"/>
+        </w:rPr>
+        <w:t xml:space="preserve">Showboy Motors · Car dealership</w:t>
       </w:r>
     </w:p>
     <w:p>
@@ -618,7 +726,7 @@
           <w:sz w:val="20"/>
           <w:szCs w:val="20"/>
         </w:rPr>
-        <w:t xml:space="preserve">Managed day-to-day operations and a team of eight, including the secretary, repair manager, assistants and general staff.</w:t>
+        <w:t xml:space="preserve">Ran inventory control for the dealership, recording every car part received and tracking each vehicle moving out for inspection, repairs and painting.</w:t>
       </w:r>
     </w:p>
     <w:p>
@@ -637,51 +745,7 @@
           <w:sz w:val="20"/>
           <w:szCs w:val="20"/>
         </w:rPr>
-        <w:t xml:space="preserve">Closed vehicle sales and handled the buying and selling of cars.</w:t>
-      </w:r>
-    </w:p>
-    <w:p>
-      <w:pPr>
-        <w:tabs>
-          <w:tab w:val="right" w:pos="9890"/>
-        </w:tabs>
-        <w:spacing w:after="0" w:before="140"/>
-      </w:pPr>
-      <w:r>
-        <w:rPr>
-          <w:rFonts w:ascii="Calibri" w:cs="Calibri" w:eastAsia="Calibri" w:hAnsi="Calibri"/>
-          <w:b/>
-          <w:bCs/>
-          <w:color w:val="0E1116"/>
-          <w:sz w:val="22"/>
-          <w:szCs w:val="22"/>
-        </w:rPr>
-        <w:t xml:space="preserve">Founder &amp; Owner</w:t>
-      </w:r>
-      <w:r>
-        <w:rPr>
-          <w:rFonts w:ascii="Calibri" w:cs="Calibri" w:eastAsia="Calibri" w:hAnsi="Calibri"/>
-          <w:b/>
-          <w:bCs/>
-          <w:color w:val="6B7383"/>
-          <w:sz w:val="18"/>
-          <w:szCs w:val="18"/>
-        </w:rPr>
-        <w:t xml:space="preserve">	3 years</w:t>
-      </w:r>
-    </w:p>
-    <w:p>
-      <w:pPr>
-        <w:spacing w:after="60"/>
-      </w:pPr>
-      <w:r>
-        <w:rPr>
-          <w:rFonts w:ascii="Calibri" w:cs="Calibri" w:eastAsia="Calibri" w:hAnsi="Calibri"/>
-          <w:color w:val="2F63E0"/>
-          <w:sz w:val="19"/>
-          <w:szCs w:val="19"/>
-        </w:rPr>
-        <w:t xml:space="preserve">Samalad Catfish Farm</w:t>
+        <w:t xml:space="preserve">Kept the full sales record for every car sold, tracking each vehicle from import cost to sale price, with profit margins and losses.</w:t>
       </w:r>
     </w:p>
     <w:p>
@@ -700,7 +764,7 @@
           <w:sz w:val="20"/>
           <w:szCs w:val="20"/>
         </w:rPr>
-        <w:t xml:space="preserve">Founded and ran a commercial catfish farm with 10 ponds, planned around a 10-tonne annual production target.</w:t>
+        <w:t xml:space="preserve">Managed day-to-day operations and a team of eight, including the secretary, repair manager, assistants and general staff.</w:t>
       </w:r>
     </w:p>
     <w:p>
@@ -719,7 +783,53 @@
           <w:sz w:val="20"/>
           <w:szCs w:val="20"/>
         </w:rPr>
-        <w:t xml:space="preserve">Managed the full production cycle: species and fingerling selection, stocking, feeding and feed conversion ratio (FCR), sorting and grading, and grow-out to large market sizes.</w:t>
+        <w:t xml:space="preserve">Closed vehicle sales and handled the buying and selling of cars.</w:t>
+      </w:r>
+    </w:p>
+    <w:p>
+      <w:pPr>
+        <w:keepNext/>
+        <w:tabs>
+          <w:tab w:val="right" w:pos="9890"/>
+        </w:tabs>
+        <w:spacing w:after="0" w:before="140"/>
+      </w:pPr>
+      <w:r>
+        <w:rPr>
+          <w:rFonts w:ascii="Calibri" w:cs="Calibri" w:eastAsia="Calibri" w:hAnsi="Calibri"/>
+          <w:b/>
+          <w:bCs/>
+          <w:color w:val="0E1116"/>
+          <w:sz w:val="22"/>
+          <w:szCs w:val="22"/>
+        </w:rPr>
+        <w:t xml:space="preserve">Catfish Farmer · Owner-Operator</w:t>
+      </w:r>
+      <w:r>
+        <w:rPr>
+          <w:rFonts w:ascii="Calibri" w:cs="Calibri" w:eastAsia="Calibri" w:hAnsi="Calibri"/>
+          <w:b/>
+          <w:bCs/>
+          <w:color w:val="6B7383"/>
+          <w:sz w:val="18"/>
+          <w:szCs w:val="18"/>
+        </w:rPr>
+        <w:t xml:space="preserve">	3 years</w:t>
+      </w:r>
+    </w:p>
+    <w:p>
+      <w:pPr>
+        <w:keepNext/>
+        <w:spacing w:after="60"/>
+      </w:pPr>
+      <w:r>
+        <w:rPr>
+          <w:rFonts w:ascii="Calibri" w:cs="Calibri" w:eastAsia="Calibri" w:hAnsi="Calibri"/>
+          <w:color w:val="2F63E0"/>
+          <w:sz w:val="19"/>
+          <w:szCs w:val="19"/>
+        </w:rPr>
+        <w:t xml:space="preserve">Samalad Farm · rented ponds</w:t>
       </w:r>
     </w:p>
     <w:p>
@@ -738,51 +848,7 @@
           <w:sz w:val="20"/>
           <w:szCs w:val="20"/>
         </w:rPr>
-        <w:t xml:space="preserve">Sold harvested catfish directly to buyers.</w:t>
-      </w:r>
-    </w:p>
-    <w:p>
-      <w:pPr>
-        <w:tabs>
-          <w:tab w:val="right" w:pos="9890"/>
-        </w:tabs>
-        <w:spacing w:after="0" w:before="140"/>
-      </w:pPr>
-      <w:r>
-        <w:rPr>
-          <w:rFonts w:ascii="Calibri" w:cs="Calibri" w:eastAsia="Calibri" w:hAnsi="Calibri"/>
-          <w:b/>
-          <w:bCs/>
-          <w:color w:val="0E1116"/>
-          <w:sz w:val="22"/>
-          <w:szCs w:val="22"/>
-        </w:rPr>
-        <w:t xml:space="preserve">Visual Artist</w:t>
-      </w:r>
-      <w:r>
-        <w:rPr>
-          <w:rFonts w:ascii="Calibri" w:cs="Calibri" w:eastAsia="Calibri" w:hAnsi="Calibri"/>
-          <w:b/>
-          <w:bCs/>
-          <w:color w:val="6B7383"/>
-          <w:sz w:val="18"/>
-          <w:szCs w:val="18"/>
-        </w:rPr>
-        <w:t xml:space="preserve">	2016 – Present</w:t>
-      </w:r>
-    </w:p>
-    <w:p>
-      <w:pPr>
-        <w:spacing w:after="60"/>
-      </w:pPr>
-      <w:r>
-        <w:rPr>
-          <w:rFonts w:ascii="Calibri" w:cs="Calibri" w:eastAsia="Calibri" w:hAnsi="Calibri"/>
-          <w:color w:val="2F63E0"/>
-          <w:sz w:val="19"/>
-          <w:szCs w:val="19"/>
-        </w:rPr>
-        <w:t xml:space="preserve">Graphite, charcoal &amp; digital</w:t>
+        <w:t xml:space="preserve">Rented 10 ponds at Samalad Farm and ran an independent catfish farming business for three years, planned around a 10-tonne annual production target.</w:t>
       </w:r>
     </w:p>
     <w:p>
@@ -801,7 +867,7 @@
           <w:sz w:val="20"/>
           <w:szCs w:val="20"/>
         </w:rPr>
-        <w:t xml:space="preserve">Self-taught artist, drawing since 2015 and practising seriously since 2016.</w:t>
+        <w:t xml:space="preserve">Managed the full production cycle: species and fingerling selection, stocking, feeding and feed conversion ratio (FCR), sorting and grading, and grow-out to large market sizes.</w:t>
       </w:r>
     </w:p>
     <w:p>
@@ -820,7 +886,53 @@
           <w:sz w:val="20"/>
           <w:szCs w:val="20"/>
         </w:rPr>
-        <w:t xml:space="preserve">Published two NFT collections on OpenSea: the CMVNG Collection (17 works) and the World Over Series (2 works).</w:t>
+        <w:t xml:space="preserve">Sold harvested catfish directly to buyers.</w:t>
+      </w:r>
+    </w:p>
+    <w:p>
+      <w:pPr>
+        <w:keepNext/>
+        <w:tabs>
+          <w:tab w:val="right" w:pos="9890"/>
+        </w:tabs>
+        <w:spacing w:after="0" w:before="140"/>
+      </w:pPr>
+      <w:r>
+        <w:rPr>
+          <w:rFonts w:ascii="Calibri" w:cs="Calibri" w:eastAsia="Calibri" w:hAnsi="Calibri"/>
+          <w:b/>
+          <w:bCs/>
+          <w:color w:val="0E1116"/>
+          <w:sz w:val="22"/>
+          <w:szCs w:val="22"/>
+        </w:rPr>
+        <w:t xml:space="preserve">Visual Artist</w:t>
+      </w:r>
+      <w:r>
+        <w:rPr>
+          <w:rFonts w:ascii="Calibri" w:cs="Calibri" w:eastAsia="Calibri" w:hAnsi="Calibri"/>
+          <w:b/>
+          <w:bCs/>
+          <w:color w:val="6B7383"/>
+          <w:sz w:val="18"/>
+          <w:szCs w:val="18"/>
+        </w:rPr>
+        <w:t xml:space="preserve">	2016 – Present</w:t>
+      </w:r>
+    </w:p>
+    <w:p>
+      <w:pPr>
+        <w:keepNext/>
+        <w:spacing w:after="60"/>
+      </w:pPr>
+      <w:r>
+        <w:rPr>
+          <w:rFonts w:ascii="Calibri" w:cs="Calibri" w:eastAsia="Calibri" w:hAnsi="Calibri"/>
+          <w:color w:val="2F63E0"/>
+          <w:sz w:val="19"/>
+          <w:szCs w:val="19"/>
+        </w:rPr>
+        <w:t xml:space="preserve">Graphite, charcoal &amp; digital</w:t>
       </w:r>
     </w:p>
     <w:p>
@@ -839,111 +951,7 @@
           <w:sz w:val="20"/>
           <w:szCs w:val="20"/>
         </w:rPr>
-        <w:t xml:space="preserve">Work explores power, war, love and the everyday struggle for meaning, in pieces such as </w:t>
-      </w:r>
-      <w:r>
-        <w:rPr>
-          <w:rFonts w:ascii="Calibri" w:cs="Calibri" w:eastAsia="Calibri" w:hAnsi="Calibri"/>
-          <w:i/>
-          <w:iCs/>
-          <w:color w:val="3A4150"/>
-          <w:sz w:val="20"/>
-          <w:szCs w:val="20"/>
-        </w:rPr>
-        <w:t xml:space="preserve">Police Brutality 1</w:t>
-      </w:r>
-      <w:r>
-        <w:rPr>
-          <w:rFonts w:ascii="Calibri" w:cs="Calibri" w:eastAsia="Calibri" w:hAnsi="Calibri"/>
-          <w:color w:val="3A4150"/>
-          <w:sz w:val="20"/>
-          <w:szCs w:val="20"/>
-        </w:rPr>
-        <w:t xml:space="preserve">, </w:t>
-      </w:r>
-      <w:r>
-        <w:rPr>
-          <w:rFonts w:ascii="Calibri" w:cs="Calibri" w:eastAsia="Calibri" w:hAnsi="Calibri"/>
-          <w:i/>
-          <w:iCs/>
-          <w:color w:val="3A4150"/>
-          <w:sz w:val="20"/>
-          <w:szCs w:val="20"/>
-        </w:rPr>
-        <w:t xml:space="preserve">Desolation</w:t>
-      </w:r>
-      <w:r>
-        <w:rPr>
-          <w:rFonts w:ascii="Calibri" w:cs="Calibri" w:eastAsia="Calibri" w:hAnsi="Calibri"/>
-          <w:color w:val="3A4150"/>
-          <w:sz w:val="20"/>
-          <w:szCs w:val="20"/>
-        </w:rPr>
-        <w:t xml:space="preserve"> and </w:t>
-      </w:r>
-      <w:r>
-        <w:rPr>
-          <w:rFonts w:ascii="Calibri" w:cs="Calibri" w:eastAsia="Calibri" w:hAnsi="Calibri"/>
-          <w:i/>
-          <w:iCs/>
-          <w:color w:val="3A4150"/>
-          <w:sz w:val="20"/>
-          <w:szCs w:val="20"/>
-        </w:rPr>
-        <w:t xml:space="preserve">The Naira</w:t>
-      </w:r>
-      <w:r>
-        <w:rPr>
-          <w:rFonts w:ascii="Calibri" w:cs="Calibri" w:eastAsia="Calibri" w:hAnsi="Calibri"/>
-          <w:color w:val="3A4150"/>
-          <w:sz w:val="20"/>
-          <w:szCs w:val="20"/>
-        </w:rPr>
-        <w:t xml:space="preserve">.</w:t>
-      </w:r>
-    </w:p>
-    <w:p>
-      <w:pPr>
-        <w:tabs>
-          <w:tab w:val="right" w:pos="9890"/>
-        </w:tabs>
-        <w:spacing w:after="0" w:before="140"/>
-      </w:pPr>
-      <w:r>
-        <w:rPr>
-          <w:rFonts w:ascii="Calibri" w:cs="Calibri" w:eastAsia="Calibri" w:hAnsi="Calibri"/>
-          <w:b/>
-          <w:bCs/>
-          <w:color w:val="0E1116"/>
-          <w:sz w:val="22"/>
-          <w:szCs w:val="22"/>
-        </w:rPr>
-        <w:t xml:space="preserve">Content Creator</w:t>
-      </w:r>
-      <w:r>
-        <w:rPr>
-          <w:rFonts w:ascii="Calibri" w:cs="Calibri" w:eastAsia="Calibri" w:hAnsi="Calibri"/>
-          <w:b/>
-          <w:bCs/>
-          <w:color w:val="6B7383"/>
-          <w:sz w:val="18"/>
-          <w:szCs w:val="18"/>
-        </w:rPr>
-        <w:t xml:space="preserve">	Present</w:t>
-      </w:r>
-    </w:p>
-    <w:p>
-      <w:pPr>
-        <w:spacing w:after="60"/>
-      </w:pPr>
-      <w:r>
-        <w:rPr>
-          <w:rFonts w:ascii="Calibri" w:cs="Calibri" w:eastAsia="Calibri" w:hAnsi="Calibri"/>
-          <w:color w:val="2F63E0"/>
-          <w:sz w:val="19"/>
-          <w:szCs w:val="19"/>
-        </w:rPr>
-        <w:t xml:space="preserve">X &amp; Instagram</w:t>
+        <w:t xml:space="preserve">Self-taught artist, drawing since 2015 and practising seriously since 2016.</w:t>
       </w:r>
     </w:p>
     <w:p>
@@ -962,51 +970,7 @@
           <w:sz w:val="20"/>
           <w:szCs w:val="20"/>
         </w:rPr>
-        <w:t xml:space="preserve">Creates and publishes content on X (@i_am_vickyd) and Instagram (@cmv.ng), sharing artwork, market views and the products he builds.</w:t>
-      </w:r>
-    </w:p>
-    <w:p>
-      <w:pPr>
-        <w:tabs>
-          <w:tab w:val="right" w:pos="9890"/>
-        </w:tabs>
-        <w:spacing w:after="0" w:before="140"/>
-      </w:pPr>
-      <w:r>
-        <w:rPr>
-          <w:rFonts w:ascii="Calibri" w:cs="Calibri" w:eastAsia="Calibri" w:hAnsi="Calibri"/>
-          <w:b/>
-          <w:bCs/>
-          <w:color w:val="0E1116"/>
-          <w:sz w:val="22"/>
-          <w:szCs w:val="22"/>
-        </w:rPr>
-        <w:t xml:space="preserve">Outdoor Cooking &amp; Barbecue</w:t>
-      </w:r>
-      <w:r>
-        <w:rPr>
-          <w:rFonts w:ascii="Calibri" w:cs="Calibri" w:eastAsia="Calibri" w:hAnsi="Calibri"/>
-          <w:b/>
-          <w:bCs/>
-          <w:color w:val="6B7383"/>
-          <w:sz w:val="18"/>
-          <w:szCs w:val="18"/>
-        </w:rPr>
-        <w:t xml:space="preserve">	2018 – 2020</w:t>
-      </w:r>
-    </w:p>
-    <w:p>
-      <w:pPr>
-        <w:spacing w:after="60"/>
-      </w:pPr>
-      <w:r>
-        <w:rPr>
-          <w:rFonts w:ascii="Calibri" w:cs="Calibri" w:eastAsia="Calibri" w:hAnsi="Calibri"/>
-          <w:color w:val="2F63E0"/>
-          <w:sz w:val="19"/>
-          <w:szCs w:val="19"/>
-        </w:rPr>
-        <w:t xml:space="preserve">Independent</w:t>
+        <w:t xml:space="preserve">Published two NFT collections on OpenSea: the CMVNG Collection (17 works) and the World Over Series (2 works).</w:t>
       </w:r>
     </w:p>
     <w:p>
@@ -1025,7 +989,113 @@
           <w:sz w:val="20"/>
           <w:szCs w:val="20"/>
         </w:rPr>
-        <w:t xml:space="preserve">Ran outdoor charcoal barbecue cooking for two years, specialising in chicken and goat meat.</w:t>
+        <w:t xml:space="preserve">Work explores power, war, love and the everyday struggle for meaning, in pieces such as </w:t>
+      </w:r>
+      <w:r>
+        <w:rPr>
+          <w:rFonts w:ascii="Calibri" w:cs="Calibri" w:eastAsia="Calibri" w:hAnsi="Calibri"/>
+          <w:i/>
+          <w:iCs/>
+          <w:color w:val="3A4150"/>
+          <w:sz w:val="20"/>
+          <w:szCs w:val="20"/>
+        </w:rPr>
+        <w:t xml:space="preserve">Police Brutality 1</w:t>
+      </w:r>
+      <w:r>
+        <w:rPr>
+          <w:rFonts w:ascii="Calibri" w:cs="Calibri" w:eastAsia="Calibri" w:hAnsi="Calibri"/>
+          <w:color w:val="3A4150"/>
+          <w:sz w:val="20"/>
+          <w:szCs w:val="20"/>
+        </w:rPr>
+        <w:t xml:space="preserve">, </w:t>
+      </w:r>
+      <w:r>
+        <w:rPr>
+          <w:rFonts w:ascii="Calibri" w:cs="Calibri" w:eastAsia="Calibri" w:hAnsi="Calibri"/>
+          <w:i/>
+          <w:iCs/>
+          <w:color w:val="3A4150"/>
+          <w:sz w:val="20"/>
+          <w:szCs w:val="20"/>
+        </w:rPr>
+        <w:t xml:space="preserve">Desolation</w:t>
+      </w:r>
+      <w:r>
+        <w:rPr>
+          <w:rFonts w:ascii="Calibri" w:cs="Calibri" w:eastAsia="Calibri" w:hAnsi="Calibri"/>
+          <w:color w:val="3A4150"/>
+          <w:sz w:val="20"/>
+          <w:szCs w:val="20"/>
+        </w:rPr>
+        <w:t xml:space="preserve"> and </w:t>
+      </w:r>
+      <w:r>
+        <w:rPr>
+          <w:rFonts w:ascii="Calibri" w:cs="Calibri" w:eastAsia="Calibri" w:hAnsi="Calibri"/>
+          <w:i/>
+          <w:iCs/>
+          <w:color w:val="3A4150"/>
+          <w:sz w:val="20"/>
+          <w:szCs w:val="20"/>
+        </w:rPr>
+        <w:t xml:space="preserve">The Naira</w:t>
+      </w:r>
+      <w:r>
+        <w:rPr>
+          <w:rFonts w:ascii="Calibri" w:cs="Calibri" w:eastAsia="Calibri" w:hAnsi="Calibri"/>
+          <w:color w:val="3A4150"/>
+          <w:sz w:val="20"/>
+          <w:szCs w:val="20"/>
+        </w:rPr>
+        <w:t xml:space="preserve">.</w:t>
+      </w:r>
+    </w:p>
+    <w:p>
+      <w:pPr>
+        <w:keepNext/>
+        <w:tabs>
+          <w:tab w:val="right" w:pos="9890"/>
+        </w:tabs>
+        <w:spacing w:after="0" w:before="140"/>
+      </w:pPr>
+      <w:r>
+        <w:rPr>
+          <w:rFonts w:ascii="Calibri" w:cs="Calibri" w:eastAsia="Calibri" w:hAnsi="Calibri"/>
+          <w:b/>
+          <w:bCs/>
+          <w:color w:val="0E1116"/>
+          <w:sz w:val="22"/>
+          <w:szCs w:val="22"/>
+        </w:rPr>
+        <w:t xml:space="preserve">Content Creator</w:t>
+      </w:r>
+      <w:r>
+        <w:rPr>
+          <w:rFonts w:ascii="Calibri" w:cs="Calibri" w:eastAsia="Calibri" w:hAnsi="Calibri"/>
+          <w:b/>
+          <w:bCs/>
+          <w:color w:val="6B7383"/>
+          <w:sz w:val="18"/>
+          <w:szCs w:val="18"/>
+        </w:rPr>
+        <w:t xml:space="preserve">	Present</w:t>
+      </w:r>
+    </w:p>
+    <w:p>
+      <w:pPr>
+        <w:keepNext/>
+        <w:spacing w:after="60"/>
+      </w:pPr>
+      <w:r>
+        <w:rPr>
+          <w:rFonts w:ascii="Calibri" w:cs="Calibri" w:eastAsia="Calibri" w:hAnsi="Calibri"/>
+          <w:color w:val="2F63E0"/>
+          <w:sz w:val="19"/>
+          <w:szCs w:val="19"/>
+        </w:rPr>
+        <w:t xml:space="preserve">X &amp; Instagram</w:t>
       </w:r>
     </w:p>
     <w:p>
@@ -1044,15 +1114,100 @@
           <w:sz w:val="20"/>
           <w:szCs w:val="20"/>
         </w:rPr>
+        <w:t xml:space="preserve">Creates and publishes content on X (@i_am_vickyd) and Instagram (@cmv.ng), sharing artwork, market views and new products.</w:t>
+      </w:r>
+    </w:p>
+    <w:p>
+      <w:pPr>
+        <w:keepNext/>
+        <w:tabs>
+          <w:tab w:val="right" w:pos="9890"/>
+        </w:tabs>
+        <w:spacing w:after="0" w:before="140"/>
+      </w:pPr>
+      <w:r>
+        <w:rPr>
+          <w:rFonts w:ascii="Calibri" w:cs="Calibri" w:eastAsia="Calibri" w:hAnsi="Calibri"/>
+          <w:b/>
+          <w:bCs/>
+          <w:color w:val="0E1116"/>
+          <w:sz w:val="22"/>
+          <w:szCs w:val="22"/>
+        </w:rPr>
+        <w:t xml:space="preserve">Outdoor Cooking &amp; Barbecue</w:t>
+      </w:r>
+      <w:r>
+        <w:rPr>
+          <w:rFonts w:ascii="Calibri" w:cs="Calibri" w:eastAsia="Calibri" w:hAnsi="Calibri"/>
+          <w:b/>
+          <w:bCs/>
+          <w:color w:val="6B7383"/>
+          <w:sz w:val="18"/>
+          <w:szCs w:val="18"/>
+        </w:rPr>
+        <w:t xml:space="preserve">	2018 – 2020</w:t>
+      </w:r>
+    </w:p>
+    <w:p>
+      <w:pPr>
+        <w:keepNext/>
+        <w:spacing w:after="60"/>
+      </w:pPr>
+      <w:r>
+        <w:rPr>
+          <w:rFonts w:ascii="Calibri" w:cs="Calibri" w:eastAsia="Calibri" w:hAnsi="Calibri"/>
+          <w:color w:val="2F63E0"/>
+          <w:sz w:val="19"/>
+          <w:szCs w:val="19"/>
+        </w:rPr>
+        <w:t xml:space="preserve">Independent</w:t>
+      </w:r>
+    </w:p>
+    <w:p>
+      <w:pPr>
+        <w:pStyle w:val="ListParagraph"/>
+        <w:numPr>
+          <w:ilvl w:val="0"/>
+          <w:numId w:val="2"/>
+        </w:numPr>
+        <w:spacing w:after="40"/>
+      </w:pPr>
+      <w:r>
+        <w:rPr>
+          <w:rFonts w:ascii="Calibri" w:cs="Calibri" w:eastAsia="Calibri" w:hAnsi="Calibri"/>
+          <w:color w:val="3A4150"/>
+          <w:sz w:val="20"/>
+          <w:szCs w:val="20"/>
+        </w:rPr>
+        <w:t xml:space="preserve">Ran outdoor charcoal barbecue cooking for two years, specialising in chicken and goat meat.</w:t>
+      </w:r>
+    </w:p>
+    <w:p>
+      <w:pPr>
+        <w:pStyle w:val="ListParagraph"/>
+        <w:numPr>
+          <w:ilvl w:val="0"/>
+          <w:numId w:val="2"/>
+        </w:numPr>
+        <w:spacing w:after="40"/>
+      </w:pPr>
+      <w:r>
+        <w:rPr>
+          <w:rFonts w:ascii="Calibri" w:cs="Calibri" w:eastAsia="Calibri" w:hAnsi="Calibri"/>
+          <w:color w:val="3A4150"/>
+          <w:sz w:val="20"/>
+          <w:szCs w:val="20"/>
+        </w:rPr>
         <w:t xml:space="preserve">Handled the full process, from seasoning and marinating the meat to grilling it over charcoal.</w:t>
       </w:r>
     </w:p>
     <w:p>
       <w:pPr>
+        <w:keepNext/>
         <w:pBdr>
           <w:bottom w:val="single" w:color="D5DAE3" w:sz="6" w:space="3"/>
         </w:pBdr>
-        <w:spacing w:after="100" w:before="260"/>
+        <w:spacing w:after="90" w:before="220"/>
       </w:pPr>
       <w:r>
         <w:rPr>
@@ -1069,6 +1224,7 @@
     </w:p>
     <w:p>
       <w:pPr>
+        <w:keepNext/>
         <w:spacing w:after="20"/>
       </w:pPr>
       <w:r>
@@ -1099,10 +1255,11 @@
     </w:p>
     <w:p>
       <w:pPr>
+        <w:keepNext/>
         <w:pBdr>
           <w:bottom w:val="single" w:color="D5DAE3" w:sz="6" w:space="3"/>
         </w:pBdr>
-        <w:spacing w:after="100" w:before="260"/>
+        <w:spacing w:after="90" w:before="220"/>
       </w:pPr>
       <w:r>
         <w:rPr>
@@ -1114,11 +1271,12 @@
           <w:sz w:val="18"/>
           <w:szCs w:val="18"/>
         </w:rPr>
-        <w:t xml:space="preserve">SELECTED PROJECTS</w:t>
-      </w:r>
-    </w:p>
-    <w:p>
-      <w:pPr>
+        <w:t xml:space="preserve">SELECTED PROJECTS · BUILT WITH AI</w:t>
+      </w:r>
+    </w:p>
+    <w:p>
+      <w:pPr>
+        <w:keepNext/>
         <w:spacing w:after="20"/>
       </w:pPr>
       <w:r>
@@ -1132,7 +1290,7 @@
         </w:rPr>
         <w:t xml:space="preserve">cmvng Picks  </w:t>
       </w:r>
-      <w:hyperlink w:history="1" r:id="rIdiz_etphdrloc7kol01mzn">
+      <w:hyperlink w:history="1" r:id="rIdptwrfqlnzdoxb_nwkc2fq">
         <w:r>
           <w:rPr>
             <w:rFonts w:ascii="Calibri" w:cs="Calibri" w:eastAsia="Calibri" w:hAnsi="Calibri"/>
@@ -1147,20 +1305,21 @@
     </w:p>
     <w:p>
       <w:pPr>
-        <w:spacing w:after="100"/>
-      </w:pPr>
-      <w:r>
-        <w:rPr>
-          <w:rFonts w:ascii="Calibri" w:cs="Calibri" w:eastAsia="Calibri" w:hAnsi="Calibri"/>
-          <w:color w:val="3A4150"/>
-          <w:sz w:val="20"/>
-          <w:szCs w:val="20"/>
-        </w:rPr>
-        <w:t xml:space="preserve">AI football predictions: a probability board that ranks the day's games for every market, daily accumulator slips across odds tiers with one-tap booking codes, an AI slip builder, and a public record of every graded pick.</w:t>
-      </w:r>
-    </w:p>
-    <w:p>
-      <w:pPr>
+        <w:spacing w:after="80"/>
+      </w:pPr>
+      <w:r>
+        <w:rPr>
+          <w:rFonts w:ascii="Calibri" w:cs="Calibri" w:eastAsia="Calibri" w:hAnsi="Calibri"/>
+          <w:color w:val="3A4150"/>
+          <w:sz w:val="20"/>
+          <w:szCs w:val="20"/>
+        </w:rPr>
+        <w:t xml:space="preserve">AI football predictions with daily accumulator slips, one-tap booking codes and a public record of every graded pick.</w:t>
+      </w:r>
+    </w:p>
+    <w:p>
+      <w:pPr>
+        <w:keepNext/>
         <w:spacing w:after="20"/>
       </w:pPr>
       <w:r>
@@ -1174,7 +1333,7 @@
         </w:rPr>
         <w:t xml:space="preserve">cmvng Signals  </w:t>
       </w:r>
-      <w:hyperlink w:history="1" r:id="rIdsyqojtguc4tcwkk5xgwyo">
+      <w:hyperlink w:history="1" r:id="rIdpqyxcwyzhd7rhdrlo5vcy">
         <w:r>
           <w:rPr>
             <w:rFonts w:ascii="Calibri" w:cs="Calibri" w:eastAsia="Calibri" w:hAnsi="Calibri"/>
@@ -1189,20 +1348,21 @@
     </w:p>
     <w:p>
       <w:pPr>
-        <w:spacing w:after="100"/>
-      </w:pPr>
-      <w:r>
-        <w:rPr>
-          <w:rFonts w:ascii="Calibri" w:cs="Calibri" w:eastAsia="Calibri" w:hAnsi="Calibri"/>
-          <w:color w:val="3A4150"/>
-          <w:sz w:val="20"/>
-          <w:szCs w:val="20"/>
-        </w:rPr>
-        <w:t xml:space="preserve">Automated forex and crypto signal bot: scans pairs across timeframes, sets entry, stop-loss and take-profit levels, executes and tracks every signal, with a live dashboard and per-pair performance. Running in paper-trading mode.</w:t>
-      </w:r>
-    </w:p>
-    <w:p>
-      <w:pPr>
+        <w:spacing w:after="80"/>
+      </w:pPr>
+      <w:r>
+        <w:rPr>
+          <w:rFonts w:ascii="Calibri" w:cs="Calibri" w:eastAsia="Calibri" w:hAnsi="Calibri"/>
+          <w:color w:val="3A4150"/>
+          <w:sz w:val="20"/>
+          <w:szCs w:val="20"/>
+        </w:rPr>
+        <w:t xml:space="preserve">Automated forex and crypto signal bot with entry, stop-loss and take-profit levels and a live results dashboard. Running in paper-trading mode.</w:t>
+      </w:r>
+    </w:p>
+    <w:p>
+      <w:pPr>
+        <w:keepNext/>
         <w:spacing w:after="20"/>
       </w:pPr>
       <w:r>
@@ -1214,9 +1374,9 @@
           <w:sz w:val="20"/>
           <w:szCs w:val="20"/>
         </w:rPr>
-        <w:t xml:space="preserve">CMVNG Art Gallery  </w:t>
-      </w:r>
-      <w:hyperlink w:history="1" r:id="rIdvq-tkiwbv6vfmfqcy1lq9">
+        <w:t xml:space="preserve">CMV AlphaScanner  </w:t>
+      </w:r>
+      <w:hyperlink w:history="1" r:id="rIdz79tahxslyiae3ejd0v9i">
         <w:r>
           <w:rPr>
             <w:rFonts w:ascii="Calibri" w:cs="Calibri" w:eastAsia="Calibri" w:hAnsi="Calibri"/>
@@ -1225,22 +1385,237 @@
             <w:szCs w:val="19"/>
             <w:u w:val="single"/>
           </w:rPr>
-          <w:t xml:space="preserve">Visit the gallery</w:t>
+          <w:t xml:space="preserve">cmv-alphascanner.vercel.app</w:t>
         </w:r>
       </w:hyperlink>
     </w:p>
     <w:p>
       <w:pPr>
-        <w:spacing w:after="100"/>
-      </w:pPr>
-      <w:r>
-        <w:rPr>
-          <w:rFonts w:ascii="Calibri" w:cs="Calibri" w:eastAsia="Calibri" w:hAnsi="Calibri"/>
-          <w:color w:val="3A4150"/>
-          <w:sz w:val="20"/>
-          <w:szCs w:val="20"/>
-        </w:rPr>
-        <w:t xml:space="preserve">Online portfolio of 21 drawings and digital works, with a full-screen viewer and a mobile studio for publishing finished pieces and works in progress.</w:t>
+        <w:spacing w:after="80"/>
+      </w:pPr>
+      <w:r>
+        <w:rPr>
+          <w:rFonts w:ascii="Calibri" w:cs="Calibri" w:eastAsia="Calibri" w:hAnsi="Calibri"/>
+          <w:color w:val="3A4150"/>
+          <w:sz w:val="20"/>
+          <w:szCs w:val="20"/>
+        </w:rPr>
+        <w:t xml:space="preserve">AI red-flag detection across 17 metrics for any crypto project, with an alpha score and a shareable verdict card.</w:t>
+      </w:r>
+    </w:p>
+    <w:p>
+      <w:pPr>
+        <w:keepNext/>
+        <w:spacing w:after="20"/>
+      </w:pPr>
+      <w:r>
+        <w:rPr>
+          <w:rFonts w:ascii="Calibri" w:cs="Calibri" w:eastAsia="Calibri" w:hAnsi="Calibri"/>
+          <w:b/>
+          <w:bCs/>
+          <w:color w:val="0E1116"/>
+          <w:sz w:val="20"/>
+          <w:szCs w:val="20"/>
+        </w:rPr>
+        <w:t xml:space="preserve">MacroSentinel  </w:t>
+      </w:r>
+      <w:hyperlink w:history="1" r:id="rId1q1dd4fagbzbgd7duhu_q">
+        <w:r>
+          <w:rPr>
+            <w:rFonts w:ascii="Calibri" w:cs="Calibri" w:eastAsia="Calibri" w:hAnsi="Calibri"/>
+            <w:color w:val="2F63E0"/>
+            <w:sz w:val="19"/>
+            <w:szCs w:val="19"/>
+            <w:u w:val="single"/>
+          </w:rPr>
+          <w:t xml:space="preserve">macro-sentinel-lac.vercel.app</w:t>
+        </w:r>
+      </w:hyperlink>
+    </w:p>
+    <w:p>
+      <w:pPr>
+        <w:spacing w:after="80"/>
+      </w:pPr>
+      <w:r>
+        <w:rPr>
+          <w:rFonts w:ascii="Calibri" w:cs="Calibri" w:eastAsia="Calibri" w:hAnsi="Calibri"/>
+          <w:color w:val="3A4150"/>
+          <w:sz w:val="20"/>
+          <w:szCs w:val="20"/>
+        </w:rPr>
+        <w:t xml:space="preserve">Macro sentiment dashboard: a daily macro pulse, a risk-on/risk-off gauge and signals across currencies, commodities and digital assets.</w:t>
+      </w:r>
+    </w:p>
+    <w:p>
+      <w:pPr>
+        <w:keepNext/>
+        <w:spacing w:after="20"/>
+      </w:pPr>
+      <w:r>
+        <w:rPr>
+          <w:rFonts w:ascii="Calibri" w:cs="Calibri" w:eastAsia="Calibri" w:hAnsi="Calibri"/>
+          <w:b/>
+          <w:bCs/>
+          <w:color w:val="0E1116"/>
+          <w:sz w:val="20"/>
+          <w:szCs w:val="20"/>
+        </w:rPr>
+        <w:t xml:space="preserve">DCA Simulator  </w:t>
+      </w:r>
+      <w:hyperlink w:history="1" r:id="rIdycyg5xk3wmnyjjkxzolqa">
+        <w:r>
+          <w:rPr>
+            <w:rFonts w:ascii="Calibri" w:cs="Calibri" w:eastAsia="Calibri" w:hAnsi="Calibri"/>
+            <w:color w:val="2F63E0"/>
+            <w:sz w:val="19"/>
+            <w:szCs w:val="19"/>
+            <w:u w:val="single"/>
+          </w:rPr>
+          <w:t xml:space="preserve">dca-simulator-one.vercel.app</w:t>
+        </w:r>
+      </w:hyperlink>
+    </w:p>
+    <w:p>
+      <w:pPr>
+        <w:spacing w:after="80"/>
+      </w:pPr>
+      <w:r>
+        <w:rPr>
+          <w:rFonts w:ascii="Calibri" w:cs="Calibri" w:eastAsia="Calibri" w:hAnsi="Calibri"/>
+          <w:color w:val="3A4150"/>
+          <w:sz w:val="20"/>
+          <w:szCs w:val="20"/>
+        </w:rPr>
+        <w:t xml:space="preserve">Dollar-cost-averaging simulator for the top 250 coins, using CoinGecko data.</w:t>
+      </w:r>
+    </w:p>
+    <w:p>
+      <w:pPr>
+        <w:keepNext/>
+        <w:spacing w:after="20"/>
+      </w:pPr>
+      <w:r>
+        <w:rPr>
+          <w:rFonts w:ascii="Calibri" w:cs="Calibri" w:eastAsia="Calibri" w:hAnsi="Calibri"/>
+          <w:b/>
+          <w:bCs/>
+          <w:color w:val="0E1116"/>
+          <w:sz w:val="20"/>
+          <w:szCs w:val="20"/>
+        </w:rPr>
+        <w:t xml:space="preserve">Bitcoin Battlefield  </w:t>
+      </w:r>
+      <w:hyperlink w:history="1" r:id="rId_e9_6ou4dgzcc8qxsuebe">
+        <w:r>
+          <w:rPr>
+            <w:rFonts w:ascii="Calibri" w:cs="Calibri" w:eastAsia="Calibri" w:hAnsi="Calibri"/>
+            <w:color w:val="2F63E0"/>
+            <w:sz w:val="19"/>
+            <w:szCs w:val="19"/>
+            <w:u w:val="single"/>
+          </w:rPr>
+          <w:t xml:space="preserve">bitcoin-battlefield-production-e9bc.up.railway.app</w:t>
+        </w:r>
+      </w:hyperlink>
+    </w:p>
+    <w:p>
+      <w:pPr>
+        <w:spacing w:after="80"/>
+      </w:pPr>
+      <w:r>
+        <w:rPr>
+          <w:rFonts w:ascii="Calibri" w:cs="Calibri" w:eastAsia="Calibri" w:hAnsi="Calibri"/>
+          <w:color w:val="3A4150"/>
+          <w:sz w:val="20"/>
+          <w:szCs w:val="20"/>
+        </w:rPr>
+        <w:t xml:space="preserve">3D strategy game where the Bitcoin price fuels a 15-minute war. Simulation only.</w:t>
+      </w:r>
+    </w:p>
+    <w:p>
+      <w:pPr>
+        <w:keepNext/>
+        <w:spacing w:after="20"/>
+      </w:pPr>
+      <w:r>
+        <w:rPr>
+          <w:rFonts w:ascii="Calibri" w:cs="Calibri" w:eastAsia="Calibri" w:hAnsi="Calibri"/>
+          <w:b/>
+          <w:bCs/>
+          <w:color w:val="0E1116"/>
+          <w:sz w:val="20"/>
+          <w:szCs w:val="20"/>
+        </w:rPr>
+        <w:t xml:space="preserve">Banger Studio  </w:t>
+      </w:r>
+      <w:hyperlink w:history="1" r:id="rIdqwfqz43ps3-f_dzcmfu8k">
+        <w:r>
+          <w:rPr>
+            <w:rFonts w:ascii="Calibri" w:cs="Calibri" w:eastAsia="Calibri" w:hAnsi="Calibri"/>
+            <w:color w:val="2F63E0"/>
+            <w:sz w:val="19"/>
+            <w:szCs w:val="19"/>
+            <w:u w:val="single"/>
+          </w:rPr>
+          <w:t xml:space="preserve">studio-production-b81c.up.railway.app</w:t>
+        </w:r>
+      </w:hyperlink>
+    </w:p>
+    <w:p>
+      <w:pPr>
+        <w:spacing w:after="80"/>
+      </w:pPr>
+      <w:r>
+        <w:rPr>
+          <w:rFonts w:ascii="Calibri" w:cs="Calibri" w:eastAsia="Calibri" w:hAnsi="Calibri"/>
+          <w:color w:val="3A4150"/>
+          <w:sz w:val="20"/>
+          <w:szCs w:val="20"/>
+        </w:rPr>
+        <w:t xml:space="preserve">AI content studio with live research, 122 editable templates and a writer that drafts in the user's voice.</w:t>
+      </w:r>
+    </w:p>
+    <w:p>
+      <w:pPr>
+        <w:keepNext/>
+        <w:spacing w:after="20"/>
+      </w:pPr>
+      <w:r>
+        <w:rPr>
+          <w:rFonts w:ascii="Calibri" w:cs="Calibri" w:eastAsia="Calibri" w:hAnsi="Calibri"/>
+          <w:b/>
+          <w:bCs/>
+          <w:color w:val="0E1116"/>
+          <w:sz w:val="20"/>
+          <w:szCs w:val="20"/>
+        </w:rPr>
+        <w:t xml:space="preserve">CMVNG Art Gallery  </w:t>
+      </w:r>
+      <w:hyperlink w:history="1" r:id="rIdela65w9l7crpfkxljx9ku">
+        <w:r>
+          <w:rPr>
+            <w:rFonts w:ascii="Calibri" w:cs="Calibri" w:eastAsia="Calibri" w:hAnsi="Calibri"/>
+            <w:color w:val="2F63E0"/>
+            <w:sz w:val="19"/>
+            <w:szCs w:val="19"/>
+            <w:u w:val="single"/>
+          </w:rPr>
+          <w:t xml:space="preserve">cmvng-art-gallery-production.up.railway.app</w:t>
+        </w:r>
+      </w:hyperlink>
+    </w:p>
+    <w:p>
+      <w:pPr>
+        <w:spacing w:after="80"/>
+      </w:pPr>
+      <w:r>
+        <w:rPr>
+          <w:rFonts w:ascii="Calibri" w:cs="Calibri" w:eastAsia="Calibri" w:hAnsi="Calibri"/>
+          <w:color w:val="3A4150"/>
+          <w:sz w:val="20"/>
+          <w:szCs w:val="20"/>
+        </w:rPr>
+        <w:t xml:space="preserve">Online portfolio of 21 drawings and digital works, with a full-screen viewer and a mobile studio for publishing new work.</w:t>
       </w:r>
     </w:p>
     <w:p>
@@ -1258,7 +1633,7 @@
         </w:rPr>
         <w:t xml:space="preserve">OpenSea collections  </w:t>
       </w:r>
-      <w:hyperlink w:history="1" r:id="rId-hitrtqmoqflwzcr2rfjm">
+      <w:hyperlink w:history="1" r:id="rIdjmdleilt2abhdlcujxznb">
         <w:r>
           <w:rPr>
             <w:rFonts w:ascii="Calibri" w:cs="Calibri" w:eastAsia="Calibri" w:hAnsi="Calibri"/>
@@ -1279,7 +1654,7 @@
         </w:rPr>
         <w:t xml:space="preserve">  ·  </w:t>
       </w:r>
-      <w:hyperlink w:history="1" r:id="rIdmepy3guvqvseijlkjhixv">
+      <w:hyperlink w:history="1" r:id="rIdd3fe81huhmdaugtp1mwar">
         <w:r>
           <w:rPr>
             <w:rFonts w:ascii="Calibri" w:cs="Calibri" w:eastAsia="Calibri" w:hAnsi="Calibri"/>
@@ -1294,10 +1669,11 @@
     </w:p>
     <w:p>
       <w:pPr>
+        <w:keepNext/>
         <w:pBdr>
           <w:bottom w:val="single" w:color="D5DAE3" w:sz="6" w:space="3"/>
         </w:pBdr>
-        <w:spacing w:after="100" w:before="260"/>
+        <w:spacing w:after="90" w:before="220"/>
       </w:pPr>
       <w:r>
         <w:rPr>
@@ -1325,16 +1701,16 @@
           <w:sz w:val="20"/>
           <w:szCs w:val="20"/>
         </w:rPr>
-        <w:t xml:space="preserve">Operations &amp; inventory: </w:t>
-      </w:r>
-      <w:r>
-        <w:rPr>
-          <w:rFonts w:ascii="Calibri" w:cs="Calibri" w:eastAsia="Calibri" w:hAnsi="Calibri"/>
-          <w:color w:val="3A4150"/>
-          <w:sz w:val="20"/>
-          <w:szCs w:val="20"/>
-        </w:rPr>
-        <w:t xml:space="preserve">Stock control, vehicle and parts tracking, record-keeping, profit and loss tracking, team supervision</w:t>
+        <w:t xml:space="preserve">AI &amp; building: </w:t>
+      </w:r>
+      <w:r>
+        <w:rPr>
+          <w:rFonts w:ascii="Calibri" w:cs="Calibri" w:eastAsia="Calibri" w:hAnsi="Calibri"/>
+          <w:color w:val="3A4150"/>
+          <w:sz w:val="20"/>
+          <w:szCs w:val="20"/>
+        </w:rPr>
+        <w:t xml:space="preserve">Claude, ChatGPT, AI-assisted building, web apps, trading bots, automation</w:t>
       </w:r>
     </w:p>
     <w:p>
@@ -1350,16 +1726,16 @@
           <w:sz w:val="20"/>
           <w:szCs w:val="20"/>
         </w:rPr>
-        <w:t xml:space="preserve">Sales: </w:t>
-      </w:r>
-      <w:r>
-        <w:rPr>
-          <w:rFonts w:ascii="Calibri" w:cs="Calibri" w:eastAsia="Calibri" w:hAnsi="Calibri"/>
-          <w:color w:val="3A4150"/>
-          <w:sz w:val="20"/>
-          <w:szCs w:val="20"/>
-        </w:rPr>
-        <w:t xml:space="preserve">Closing deals, car buying and selling, negotiation</w:t>
+        <w:t xml:space="preserve">Operations &amp; sales: </w:t>
+      </w:r>
+      <w:r>
+        <w:rPr>
+          <w:rFonts w:ascii="Calibri" w:cs="Calibri" w:eastAsia="Calibri" w:hAnsi="Calibri"/>
+          <w:color w:val="3A4150"/>
+          <w:sz w:val="20"/>
+          <w:szCs w:val="20"/>
+        </w:rPr>
+        <w:t xml:space="preserve">Stock control, vehicle and parts tracking, record-keeping, profit and loss tracking, team supervision, closing deals, car buying and selling, negotiation</w:t>
       </w:r>
     </w:p>
     <w:p>
@@ -1464,35 +1840,11 @@
     </w:p>
     <w:p>
       <w:pPr>
-        <w:spacing w:after="50"/>
-      </w:pPr>
-      <w:r>
-        <w:rPr>
-          <w:rFonts w:ascii="Calibri" w:cs="Calibri" w:eastAsia="Calibri" w:hAnsi="Calibri"/>
-          <w:b/>
-          <w:bCs/>
-          <w:color w:val="0E1116"/>
-          <w:sz w:val="20"/>
-          <w:szCs w:val="20"/>
-        </w:rPr>
-        <w:t xml:space="preserve">Digital: </w:t>
-      </w:r>
-      <w:r>
-        <w:rPr>
-          <w:rFonts w:ascii="Calibri" w:cs="Calibri" w:eastAsia="Calibri" w:hAnsi="Calibri"/>
-          <w:color w:val="3A4150"/>
-          <w:sz w:val="20"/>
-          <w:szCs w:val="20"/>
-        </w:rPr>
-        <w:t xml:space="preserve">Web products, automation, AI tools</w:t>
-      </w:r>
-    </w:p>
-    <w:p>
-      <w:pPr>
+        <w:keepNext/>
         <w:pBdr>
           <w:bottom w:val="single" w:color="D5DAE3" w:sz="6" w:space="3"/>
         </w:pBdr>
-        <w:spacing w:after="100" w:before="260"/>
+        <w:spacing w:after="90" w:before="220"/>
       </w:pPr>
       <w:r>
         <w:rPr>
@@ -1504,7 +1856,7 @@
           <w:sz w:val="18"/>
           <w:szCs w:val="18"/>
         </w:rPr>
-        <w:t xml:space="preserve">INTERESTS</w:t>
+        <w:t xml:space="preserve">INTERESTS &amp; REFERENCES</w:t>
       </w:r>
     </w:p>
     <w:p>
@@ -1523,36 +1875,18 @@
     </w:p>
     <w:p>
       <w:pPr>
-        <w:pBdr>
-          <w:bottom w:val="single" w:color="D5DAE3" w:sz="6" w:space="3"/>
-        </w:pBdr>
-        <w:spacing w:after="100" w:before="260"/>
-      </w:pPr>
-      <w:r>
-        <w:rPr>
-          <w:rFonts w:ascii="Calibri" w:cs="Calibri" w:eastAsia="Calibri" w:hAnsi="Calibri"/>
-          <w:b/>
-          <w:bCs/>
-          <w:color w:val="2F63E0"/>
-          <w:spacing w:val="40"/>
-          <w:sz w:val="18"/>
-          <w:szCs w:val="18"/>
-        </w:rPr>
-        <w:t xml:space="preserve">REFERENCES</w:t>
-      </w:r>
-    </w:p>
-    <w:p>
-      <w:pPr>
         <w:spacing w:after="60"/>
       </w:pPr>
       <w:r>
         <w:rPr>
           <w:rFonts w:ascii="Calibri" w:cs="Calibri" w:eastAsia="Calibri" w:hAnsi="Calibri"/>
-          <w:color w:val="3A4150"/>
-          <w:sz w:val="20"/>
-          <w:szCs w:val="20"/>
-        </w:rPr>
-        <w:t xml:space="preserve">Available on request.</w:t>
+          <w:i/>
+          <w:iCs/>
+          <w:color w:val="3A4150"/>
+          <w:sz w:val="20"/>
+          <w:szCs w:val="20"/>
+        </w:rPr>
+        <w:t xml:space="preserve">References available on request.</w:t>
       </w:r>
     </w:p>
     <w:sectPr>

</xml_diff>

<commit_message>
Portfolio and CV: add Limitless ambassador role and crypto content work
- Experience: Ambassador at Limitless (prediction market), Jan 2026 to present
- Content Creator entry now covers posts on crypto, finance, trading and
  prediction markets, and content on crypto projects
- Summary, skills, interests, links and the Content card updated to match
- CV PDF, Word file and preview regenerated; both stay at two pages

Co-Authored-By: Claude Opus 5.5 <noreply@anthropic.com>
Claude-Session: https://claude.ai/code/session_01RQARRjvZbGkqL6S5F9kfaq
</commit_message>
<xml_diff>
--- a/portfolio/cv/Victor-Bukola-Ojumu-CV.docx
+++ b/portfolio/cv/Victor-Bukola-Ojumu-CV.docx
@@ -83,7 +83,7 @@
               </w:rPr>
               <w:t xml:space="preserve">Lagos, Nigeria  ·  </w:t>
             </w:r>
-            <w:hyperlink w:history="1" r:id="rIdpwrmjo0coyc-dle0bfd46">
+            <w:hyperlink w:history="1" r:id="rIdassmnh2vwaomtrtvnickf">
               <w:r>
                 <w:rPr>
                   <w:rFonts w:ascii="Calibri" w:cs="Calibri" w:eastAsia="Calibri" w:hAnsi="Calibri"/>
@@ -100,7 +100,7 @@
             <w:pPr>
               <w:spacing w:after="0"/>
             </w:pPr>
-            <w:hyperlink w:history="1" r:id="rIdcntprarx4-8nuj-mmtip4">
+            <w:hyperlink w:history="1" r:id="rIdtrxlusl3nwmdyhd5j3gyb">
               <w:r>
                 <w:rPr>
                   <w:rFonts w:ascii="Calibri" w:cs="Calibri" w:eastAsia="Calibri" w:hAnsi="Calibri"/>
@@ -121,7 +121,7 @@
               </w:rPr>
               <w:t xml:space="preserve">  ·  </w:t>
             </w:r>
-            <w:hyperlink w:history="1" r:id="rIdrgc9hb1nb9n-7coxsthbt">
+            <w:hyperlink w:history="1" r:id="rIde8thl94pmavntrj-xmgtq">
               <w:r>
                 <w:rPr>
                   <w:rFonts w:ascii="Calibri" w:cs="Calibri" w:eastAsia="Calibri" w:hAnsi="Calibri"/>
@@ -142,7 +142,7 @@
               </w:rPr>
               <w:t xml:space="preserve">  ·  </w:t>
             </w:r>
-            <w:hyperlink w:history="1" r:id="rId_ednjcmyktqpwiw6datjr">
+            <w:hyperlink w:history="1" r:id="rIdntgels4rhf6bdaz6wozar">
               <w:r>
                 <w:rPr>
                   <w:rFonts w:ascii="Calibri" w:cs="Calibri" w:eastAsia="Calibri" w:hAnsi="Calibri"/>
@@ -247,7 +247,7 @@
           <w:sz w:val="20"/>
           <w:szCs w:val="20"/>
         </w:rPr>
-        <w:t xml:space="preserve">Multidisciplinary operator, artist and AI product builder based in Lagos, Nigeria. Uses AI tools such as Claude and ChatGPT to design and ship web products, with eight live in about five months, including an AI football-prediction platform and an automated forex and crypto signal bot. Managed inventory, sales records and an eight-person team at a car dealership; ran an independent catfish farming business on ten rented ponds for three years; ran outdoor charcoal barbecue cooking for two years; and has traded forex and crypto markets since 2019. A self-taught graphite and charcoal artist with two collections on OpenSea, and a Civil Engineering graduate of the Federal University Oye-Ekiti.</w:t>
+        <w:t xml:space="preserve">Multidisciplinary operator, artist, AI product builder and crypto content creator based in Lagos, Nigeria. Uses AI tools such as Claude and ChatGPT to design and ship web products, with eight live in about five months, and has been an ambassador for the Limitless prediction market since January 2026. Managed inventory, sales records and an eight-person team at a car dealership; ran an independent catfish farming business on ten rented ponds for three years; ran outdoor charcoal barbecue cooking for two years; and has traded forex and crypto since 2019. A self-taught graphite and charcoal artist with two collections on OpenSea, and a Civil Engineering graduate of the Federal University Oye-Ekiti.</w:t>
       </w:r>
     </w:p>
     <w:p>
@@ -569,7 +569,7 @@
           <w:sz w:val="20"/>
           <w:szCs w:val="20"/>
         </w:rPr>
-        <w:t xml:space="preserve">, an online portfolio with a mobile studio for publishing new and in-progress artworks.</w:t>
+        <w:t xml:space="preserve">, an online portfolio for new artworks.</w:t>
       </w:r>
     </w:p>
     <w:p>
@@ -589,7 +589,7 @@
           <w:sz w:val="22"/>
           <w:szCs w:val="22"/>
         </w:rPr>
-        <w:t xml:space="preserve">Forex &amp; Crypto Trader</w:t>
+        <w:t xml:space="preserve">Ambassador</w:t>
       </w:r>
       <w:r>
         <w:rPr>
@@ -600,7 +600,7 @@
           <w:sz w:val="18"/>
           <w:szCs w:val="18"/>
         </w:rPr>
-        <w:t xml:space="preserve">	2019 – Present</w:t>
+        <w:t xml:space="preserve">	Jan 2026 – Present</w:t>
       </w:r>
     </w:p>
     <w:p>
@@ -615,7 +615,7 @@
           <w:sz w:val="19"/>
           <w:szCs w:val="19"/>
         </w:rPr>
-        <w:t xml:space="preserve">Independent</w:t>
+        <w:t xml:space="preserve">Limitless · Prediction market</w:t>
       </w:r>
     </w:p>
     <w:p>
@@ -634,7 +634,28 @@
           <w:sz w:val="20"/>
           <w:szCs w:val="20"/>
         </w:rPr>
-        <w:t xml:space="preserve">Trades forex majors and minors and cryptocurrencies, with a primary focus on Bitcoin.</w:t>
+        <w:t xml:space="preserve">Represents </w:t>
+      </w:r>
+      <w:hyperlink w:history="1" r:id="rId_lvdqlocqed64gucgbmru">
+        <w:r>
+          <w:rPr>
+            <w:rFonts w:ascii="Calibri" w:cs="Calibri" w:eastAsia="Calibri" w:hAnsi="Calibri"/>
+            <w:color w:val="2F63E0"/>
+            <w:sz w:val="19"/>
+            <w:szCs w:val="19"/>
+            <w:u w:val="single"/>
+          </w:rPr>
+          <w:t xml:space="preserve">Limitless</w:t>
+        </w:r>
+      </w:hyperlink>
+      <w:r>
+        <w:rPr>
+          <w:rFonts w:ascii="Calibri" w:cs="Calibri" w:eastAsia="Calibri" w:hAnsi="Calibri"/>
+          <w:color w:val="3A4150"/>
+          <w:sz w:val="20"/>
+          <w:szCs w:val="20"/>
+        </w:rPr>
+        <w:t xml:space="preserve">, a prediction market for crypto, sports and world events.</w:t>
       </w:r>
     </w:p>
     <w:p>
@@ -653,7 +674,53 @@
           <w:sz w:val="20"/>
           <w:szCs w:val="20"/>
         </w:rPr>
-        <w:t xml:space="preserve">Shares market views and trade ideas with followers through a Telegram channel.</w:t>
+        <w:t xml:space="preserve">Creates and posts content about Limitless and prediction markets.</w:t>
+      </w:r>
+    </w:p>
+    <w:p>
+      <w:pPr>
+        <w:keepNext/>
+        <w:tabs>
+          <w:tab w:val="right" w:pos="9890"/>
+        </w:tabs>
+        <w:spacing w:after="0" w:before="140"/>
+      </w:pPr>
+      <w:r>
+        <w:rPr>
+          <w:rFonts w:ascii="Calibri" w:cs="Calibri" w:eastAsia="Calibri" w:hAnsi="Calibri"/>
+          <w:b/>
+          <w:bCs/>
+          <w:color w:val="0E1116"/>
+          <w:sz w:val="22"/>
+          <w:szCs w:val="22"/>
+        </w:rPr>
+        <w:t xml:space="preserve">Forex &amp; Crypto Trader</w:t>
+      </w:r>
+      <w:r>
+        <w:rPr>
+          <w:rFonts w:ascii="Calibri" w:cs="Calibri" w:eastAsia="Calibri" w:hAnsi="Calibri"/>
+          <w:b/>
+          <w:bCs/>
+          <w:color w:val="6B7383"/>
+          <w:sz w:val="18"/>
+          <w:szCs w:val="18"/>
+        </w:rPr>
+        <w:t xml:space="preserve">	2019 – Present</w:t>
+      </w:r>
+    </w:p>
+    <w:p>
+      <w:pPr>
+        <w:keepNext/>
+        <w:spacing w:after="60"/>
+      </w:pPr>
+      <w:r>
+        <w:rPr>
+          <w:rFonts w:ascii="Calibri" w:cs="Calibri" w:eastAsia="Calibri" w:hAnsi="Calibri"/>
+          <w:color w:val="2F63E0"/>
+          <w:sz w:val="19"/>
+          <w:szCs w:val="19"/>
+        </w:rPr>
+        <w:t xml:space="preserve">Independent</w:t>
       </w:r>
     </w:p>
     <w:p>
@@ -672,42 +739,7 @@
           <w:sz w:val="20"/>
           <w:szCs w:val="20"/>
         </w:rPr>
-        <w:t xml:space="preserve">Turned a manual trading approach into software by building an automated signal bot.</w:t>
-      </w:r>
-    </w:p>
-    <w:p>
-      <w:pPr>
-        <w:keepNext/>
-        <w:tabs>
-          <w:tab w:val="right" w:pos="9890"/>
-        </w:tabs>
-        <w:spacing w:after="0" w:before="140"/>
-      </w:pPr>
-      <w:r>
-        <w:rPr>
-          <w:rFonts w:ascii="Calibri" w:cs="Calibri" w:eastAsia="Calibri" w:hAnsi="Calibri"/>
-          <w:b/>
-          <w:bCs/>
-          <w:color w:val="0E1116"/>
-          <w:sz w:val="22"/>
-          <w:szCs w:val="22"/>
-        </w:rPr>
-        <w:t xml:space="preserve">Inventory Manager &amp; General Manager</w:t>
-      </w:r>
-    </w:p>
-    <w:p>
-      <w:pPr>
-        <w:keepNext/>
-        <w:spacing w:after="60"/>
-      </w:pPr>
-      <w:r>
-        <w:rPr>
-          <w:rFonts w:ascii="Calibri" w:cs="Calibri" w:eastAsia="Calibri" w:hAnsi="Calibri"/>
-          <w:color w:val="2F63E0"/>
-          <w:sz w:val="19"/>
-          <w:szCs w:val="19"/>
-        </w:rPr>
-        <w:t xml:space="preserve">Showboy Motors · Car dealership</w:t>
+        <w:t xml:space="preserve">Trades forex majors and minors and crypto, with a primary focus on Bitcoin.</w:t>
       </w:r>
     </w:p>
     <w:p>
@@ -726,7 +758,42 @@
           <w:sz w:val="20"/>
           <w:szCs w:val="20"/>
         </w:rPr>
-        <w:t xml:space="preserve">Ran inventory control for the dealership, recording every car part received and tracking each vehicle moving out for inspection, repairs and painting.</w:t>
+        <w:t xml:space="preserve">Shares market views and trade ideas with followers through a Telegram channel.</w:t>
+      </w:r>
+    </w:p>
+    <w:p>
+      <w:pPr>
+        <w:keepNext/>
+        <w:tabs>
+          <w:tab w:val="right" w:pos="9890"/>
+        </w:tabs>
+        <w:spacing w:after="0" w:before="140"/>
+      </w:pPr>
+      <w:r>
+        <w:rPr>
+          <w:rFonts w:ascii="Calibri" w:cs="Calibri" w:eastAsia="Calibri" w:hAnsi="Calibri"/>
+          <w:b/>
+          <w:bCs/>
+          <w:color w:val="0E1116"/>
+          <w:sz w:val="22"/>
+          <w:szCs w:val="22"/>
+        </w:rPr>
+        <w:t xml:space="preserve">Inventory Manager &amp; General Manager</w:t>
+      </w:r>
+    </w:p>
+    <w:p>
+      <w:pPr>
+        <w:keepNext/>
+        <w:spacing w:after="60"/>
+      </w:pPr>
+      <w:r>
+        <w:rPr>
+          <w:rFonts w:ascii="Calibri" w:cs="Calibri" w:eastAsia="Calibri" w:hAnsi="Calibri"/>
+          <w:color w:val="2F63E0"/>
+          <w:sz w:val="19"/>
+          <w:szCs w:val="19"/>
+        </w:rPr>
+        <w:t xml:space="preserve">Showboy Motors · Car dealership</w:t>
       </w:r>
     </w:p>
     <w:p>
@@ -745,7 +812,7 @@
           <w:sz w:val="20"/>
           <w:szCs w:val="20"/>
         </w:rPr>
-        <w:t xml:space="preserve">Kept the full sales record for every car sold, tracking each vehicle from import cost to sale price, with profit margins and losses.</w:t>
+        <w:t xml:space="preserve">Ran inventory control for the dealership, recording every car part received and tracking each vehicle moving out for inspection, repairs and painting.</w:t>
       </w:r>
     </w:p>
     <w:p>
@@ -764,7 +831,7 @@
           <w:sz w:val="20"/>
           <w:szCs w:val="20"/>
         </w:rPr>
-        <w:t xml:space="preserve">Managed day-to-day operations and a team of eight, including the secretary, repair manager, assistants and general staff.</w:t>
+        <w:t xml:space="preserve">Kept the full sales record for every car sold, tracking each vehicle from import cost to sale price, with profit margins and losses.</w:t>
       </w:r>
     </w:p>
     <w:p>
@@ -783,53 +850,7 @@
           <w:sz w:val="20"/>
           <w:szCs w:val="20"/>
         </w:rPr>
-        <w:t xml:space="preserve">Closed vehicle sales and handled the buying and selling of cars.</w:t>
-      </w:r>
-    </w:p>
-    <w:p>
-      <w:pPr>
-        <w:keepNext/>
-        <w:tabs>
-          <w:tab w:val="right" w:pos="9890"/>
-        </w:tabs>
-        <w:spacing w:after="0" w:before="140"/>
-      </w:pPr>
-      <w:r>
-        <w:rPr>
-          <w:rFonts w:ascii="Calibri" w:cs="Calibri" w:eastAsia="Calibri" w:hAnsi="Calibri"/>
-          <w:b/>
-          <w:bCs/>
-          <w:color w:val="0E1116"/>
-          <w:sz w:val="22"/>
-          <w:szCs w:val="22"/>
-        </w:rPr>
-        <w:t xml:space="preserve">Catfish Farmer · Owner-Operator</w:t>
-      </w:r>
-      <w:r>
-        <w:rPr>
-          <w:rFonts w:ascii="Calibri" w:cs="Calibri" w:eastAsia="Calibri" w:hAnsi="Calibri"/>
-          <w:b/>
-          <w:bCs/>
-          <w:color w:val="6B7383"/>
-          <w:sz w:val="18"/>
-          <w:szCs w:val="18"/>
-        </w:rPr>
-        <w:t xml:space="preserve">	3 years</w:t>
-      </w:r>
-    </w:p>
-    <w:p>
-      <w:pPr>
-        <w:keepNext/>
-        <w:spacing w:after="60"/>
-      </w:pPr>
-      <w:r>
-        <w:rPr>
-          <w:rFonts w:ascii="Calibri" w:cs="Calibri" w:eastAsia="Calibri" w:hAnsi="Calibri"/>
-          <w:color w:val="2F63E0"/>
-          <w:sz w:val="19"/>
-          <w:szCs w:val="19"/>
-        </w:rPr>
-        <w:t xml:space="preserve">Samalad Farm · rented ponds</w:t>
+        <w:t xml:space="preserve">Managed day-to-day operations and a team of eight, including the secretary, repair manager, assistants and general staff.</w:t>
       </w:r>
     </w:p>
     <w:p>
@@ -848,7 +869,53 @@
           <w:sz w:val="20"/>
           <w:szCs w:val="20"/>
         </w:rPr>
-        <w:t xml:space="preserve">Rented 10 ponds at Samalad Farm and ran an independent catfish farming business for three years, planned around a 10-tonne annual production target.</w:t>
+        <w:t xml:space="preserve">Closed vehicle sales and handled the buying and selling of cars.</w:t>
+      </w:r>
+    </w:p>
+    <w:p>
+      <w:pPr>
+        <w:keepNext/>
+        <w:tabs>
+          <w:tab w:val="right" w:pos="9890"/>
+        </w:tabs>
+        <w:spacing w:after="0" w:before="140"/>
+      </w:pPr>
+      <w:r>
+        <w:rPr>
+          <w:rFonts w:ascii="Calibri" w:cs="Calibri" w:eastAsia="Calibri" w:hAnsi="Calibri"/>
+          <w:b/>
+          <w:bCs/>
+          <w:color w:val="0E1116"/>
+          <w:sz w:val="22"/>
+          <w:szCs w:val="22"/>
+        </w:rPr>
+        <w:t xml:space="preserve">Catfish Farmer · Owner-Operator</w:t>
+      </w:r>
+      <w:r>
+        <w:rPr>
+          <w:rFonts w:ascii="Calibri" w:cs="Calibri" w:eastAsia="Calibri" w:hAnsi="Calibri"/>
+          <w:b/>
+          <w:bCs/>
+          <w:color w:val="6B7383"/>
+          <w:sz w:val="18"/>
+          <w:szCs w:val="18"/>
+        </w:rPr>
+        <w:t xml:space="preserve">	3 years</w:t>
+      </w:r>
+    </w:p>
+    <w:p>
+      <w:pPr>
+        <w:keepNext/>
+        <w:spacing w:after="60"/>
+      </w:pPr>
+      <w:r>
+        <w:rPr>
+          <w:rFonts w:ascii="Calibri" w:cs="Calibri" w:eastAsia="Calibri" w:hAnsi="Calibri"/>
+          <w:color w:val="2F63E0"/>
+          <w:sz w:val="19"/>
+          <w:szCs w:val="19"/>
+        </w:rPr>
+        <w:t xml:space="preserve">Samalad Farm · rented ponds</w:t>
       </w:r>
     </w:p>
     <w:p>
@@ -867,7 +934,7 @@
           <w:sz w:val="20"/>
           <w:szCs w:val="20"/>
         </w:rPr>
-        <w:t xml:space="preserve">Managed the full production cycle: species and fingerling selection, stocking, feeding and feed conversion ratio (FCR), sorting and grading, and grow-out to large market sizes.</w:t>
+        <w:t xml:space="preserve">Rented 10 ponds at Samalad Farm and ran an independent catfish farming business for three years, planned around a 10-tonne annual production target.</w:t>
       </w:r>
     </w:p>
     <w:p>
@@ -886,53 +953,7 @@
           <w:sz w:val="20"/>
           <w:szCs w:val="20"/>
         </w:rPr>
-        <w:t xml:space="preserve">Sold harvested catfish directly to buyers.</w:t>
-      </w:r>
-    </w:p>
-    <w:p>
-      <w:pPr>
-        <w:keepNext/>
-        <w:tabs>
-          <w:tab w:val="right" w:pos="9890"/>
-        </w:tabs>
-        <w:spacing w:after="0" w:before="140"/>
-      </w:pPr>
-      <w:r>
-        <w:rPr>
-          <w:rFonts w:ascii="Calibri" w:cs="Calibri" w:eastAsia="Calibri" w:hAnsi="Calibri"/>
-          <w:b/>
-          <w:bCs/>
-          <w:color w:val="0E1116"/>
-          <w:sz w:val="22"/>
-          <w:szCs w:val="22"/>
-        </w:rPr>
-        <w:t xml:space="preserve">Visual Artist</w:t>
-      </w:r>
-      <w:r>
-        <w:rPr>
-          <w:rFonts w:ascii="Calibri" w:cs="Calibri" w:eastAsia="Calibri" w:hAnsi="Calibri"/>
-          <w:b/>
-          <w:bCs/>
-          <w:color w:val="6B7383"/>
-          <w:sz w:val="18"/>
-          <w:szCs w:val="18"/>
-        </w:rPr>
-        <w:t xml:space="preserve">	2016 – Present</w:t>
-      </w:r>
-    </w:p>
-    <w:p>
-      <w:pPr>
-        <w:keepNext/>
-        <w:spacing w:after="60"/>
-      </w:pPr>
-      <w:r>
-        <w:rPr>
-          <w:rFonts w:ascii="Calibri" w:cs="Calibri" w:eastAsia="Calibri" w:hAnsi="Calibri"/>
-          <w:color w:val="2F63E0"/>
-          <w:sz w:val="19"/>
-          <w:szCs w:val="19"/>
-        </w:rPr>
-        <w:t xml:space="preserve">Graphite, charcoal &amp; digital</w:t>
+        <w:t xml:space="preserve">Managed the full production cycle: species and fingerling selection, stocking, feeding and feed conversion ratio (FCR), sorting and grading, and grow-out to large market sizes.</w:t>
       </w:r>
     </w:p>
     <w:p>
@@ -951,7 +972,53 @@
           <w:sz w:val="20"/>
           <w:szCs w:val="20"/>
         </w:rPr>
-        <w:t xml:space="preserve">Self-taught artist, drawing since 2015 and practising seriously since 2016.</w:t>
+        <w:t xml:space="preserve">Sold harvested catfish directly to buyers.</w:t>
+      </w:r>
+    </w:p>
+    <w:p>
+      <w:pPr>
+        <w:keepNext/>
+        <w:tabs>
+          <w:tab w:val="right" w:pos="9890"/>
+        </w:tabs>
+        <w:spacing w:after="0" w:before="140"/>
+      </w:pPr>
+      <w:r>
+        <w:rPr>
+          <w:rFonts w:ascii="Calibri" w:cs="Calibri" w:eastAsia="Calibri" w:hAnsi="Calibri"/>
+          <w:b/>
+          <w:bCs/>
+          <w:color w:val="0E1116"/>
+          <w:sz w:val="22"/>
+          <w:szCs w:val="22"/>
+        </w:rPr>
+        <w:t xml:space="preserve">Visual Artist</w:t>
+      </w:r>
+      <w:r>
+        <w:rPr>
+          <w:rFonts w:ascii="Calibri" w:cs="Calibri" w:eastAsia="Calibri" w:hAnsi="Calibri"/>
+          <w:b/>
+          <w:bCs/>
+          <w:color w:val="6B7383"/>
+          <w:sz w:val="18"/>
+          <w:szCs w:val="18"/>
+        </w:rPr>
+        <w:t xml:space="preserve">	2016 – Present</w:t>
+      </w:r>
+    </w:p>
+    <w:p>
+      <w:pPr>
+        <w:keepNext/>
+        <w:spacing w:after="60"/>
+      </w:pPr>
+      <w:r>
+        <w:rPr>
+          <w:rFonts w:ascii="Calibri" w:cs="Calibri" w:eastAsia="Calibri" w:hAnsi="Calibri"/>
+          <w:color w:val="2F63E0"/>
+          <w:sz w:val="19"/>
+          <w:szCs w:val="19"/>
+        </w:rPr>
+        <w:t xml:space="preserve">Graphite, charcoal &amp; digital</w:t>
       </w:r>
     </w:p>
     <w:p>
@@ -970,7 +1037,7 @@
           <w:sz w:val="20"/>
           <w:szCs w:val="20"/>
         </w:rPr>
-        <w:t xml:space="preserve">Published two NFT collections on OpenSea: the CMVNG Collection (17 works) and the World Over Series (2 works).</w:t>
+        <w:t xml:space="preserve">Self-taught artist, drawing since 2015 and practising seriously since 2016.</w:t>
       </w:r>
     </w:p>
     <w:p>
@@ -989,113 +1056,7 @@
           <w:sz w:val="20"/>
           <w:szCs w:val="20"/>
         </w:rPr>
-        <w:t xml:space="preserve">Work explores power, war, love and the everyday struggle for meaning, in pieces such as </w:t>
-      </w:r>
-      <w:r>
-        <w:rPr>
-          <w:rFonts w:ascii="Calibri" w:cs="Calibri" w:eastAsia="Calibri" w:hAnsi="Calibri"/>
-          <w:i/>
-          <w:iCs/>
-          <w:color w:val="3A4150"/>
-          <w:sz w:val="20"/>
-          <w:szCs w:val="20"/>
-        </w:rPr>
-        <w:t xml:space="preserve">Police Brutality 1</w:t>
-      </w:r>
-      <w:r>
-        <w:rPr>
-          <w:rFonts w:ascii="Calibri" w:cs="Calibri" w:eastAsia="Calibri" w:hAnsi="Calibri"/>
-          <w:color w:val="3A4150"/>
-          <w:sz w:val="20"/>
-          <w:szCs w:val="20"/>
-        </w:rPr>
-        <w:t xml:space="preserve">, </w:t>
-      </w:r>
-      <w:r>
-        <w:rPr>
-          <w:rFonts w:ascii="Calibri" w:cs="Calibri" w:eastAsia="Calibri" w:hAnsi="Calibri"/>
-          <w:i/>
-          <w:iCs/>
-          <w:color w:val="3A4150"/>
-          <w:sz w:val="20"/>
-          <w:szCs w:val="20"/>
-        </w:rPr>
-        <w:t xml:space="preserve">Desolation</w:t>
-      </w:r>
-      <w:r>
-        <w:rPr>
-          <w:rFonts w:ascii="Calibri" w:cs="Calibri" w:eastAsia="Calibri" w:hAnsi="Calibri"/>
-          <w:color w:val="3A4150"/>
-          <w:sz w:val="20"/>
-          <w:szCs w:val="20"/>
-        </w:rPr>
-        <w:t xml:space="preserve"> and </w:t>
-      </w:r>
-      <w:r>
-        <w:rPr>
-          <w:rFonts w:ascii="Calibri" w:cs="Calibri" w:eastAsia="Calibri" w:hAnsi="Calibri"/>
-          <w:i/>
-          <w:iCs/>
-          <w:color w:val="3A4150"/>
-          <w:sz w:val="20"/>
-          <w:szCs w:val="20"/>
-        </w:rPr>
-        <w:t xml:space="preserve">The Naira</w:t>
-      </w:r>
-      <w:r>
-        <w:rPr>
-          <w:rFonts w:ascii="Calibri" w:cs="Calibri" w:eastAsia="Calibri" w:hAnsi="Calibri"/>
-          <w:color w:val="3A4150"/>
-          <w:sz w:val="20"/>
-          <w:szCs w:val="20"/>
-        </w:rPr>
-        <w:t xml:space="preserve">.</w:t>
-      </w:r>
-    </w:p>
-    <w:p>
-      <w:pPr>
-        <w:keepNext/>
-        <w:tabs>
-          <w:tab w:val="right" w:pos="9890"/>
-        </w:tabs>
-        <w:spacing w:after="0" w:before="140"/>
-      </w:pPr>
-      <w:r>
-        <w:rPr>
-          <w:rFonts w:ascii="Calibri" w:cs="Calibri" w:eastAsia="Calibri" w:hAnsi="Calibri"/>
-          <w:b/>
-          <w:bCs/>
-          <w:color w:val="0E1116"/>
-          <w:sz w:val="22"/>
-          <w:szCs w:val="22"/>
-        </w:rPr>
-        <w:t xml:space="preserve">Content Creator</w:t>
-      </w:r>
-      <w:r>
-        <w:rPr>
-          <w:rFonts w:ascii="Calibri" w:cs="Calibri" w:eastAsia="Calibri" w:hAnsi="Calibri"/>
-          <w:b/>
-          <w:bCs/>
-          <w:color w:val="6B7383"/>
-          <w:sz w:val="18"/>
-          <w:szCs w:val="18"/>
-        </w:rPr>
-        <w:t xml:space="preserve">	Present</w:t>
-      </w:r>
-    </w:p>
-    <w:p>
-      <w:pPr>
-        <w:keepNext/>
-        <w:spacing w:after="60"/>
-      </w:pPr>
-      <w:r>
-        <w:rPr>
-          <w:rFonts w:ascii="Calibri" w:cs="Calibri" w:eastAsia="Calibri" w:hAnsi="Calibri"/>
-          <w:color w:val="2F63E0"/>
-          <w:sz w:val="19"/>
-          <w:szCs w:val="19"/>
-        </w:rPr>
-        <w:t xml:space="preserve">X &amp; Instagram</w:t>
+        <w:t xml:space="preserve">Published two NFT collections on OpenSea: the CMVNG Collection (17 works) and the World Over Series (2 works).</w:t>
       </w:r>
     </w:p>
     <w:p>
@@ -1114,7 +1075,67 @@
           <w:sz w:val="20"/>
           <w:szCs w:val="20"/>
         </w:rPr>
-        <w:t xml:space="preserve">Creates and publishes content on X (@i_am_vickyd) and Instagram (@cmv.ng), sharing artwork, market views and new products.</w:t>
+        <w:t xml:space="preserve">Work explores power, war, love and the everyday struggle for meaning, in pieces such as </w:t>
+      </w:r>
+      <w:r>
+        <w:rPr>
+          <w:rFonts w:ascii="Calibri" w:cs="Calibri" w:eastAsia="Calibri" w:hAnsi="Calibri"/>
+          <w:i/>
+          <w:iCs/>
+          <w:color w:val="3A4150"/>
+          <w:sz w:val="20"/>
+          <w:szCs w:val="20"/>
+        </w:rPr>
+        <w:t xml:space="preserve">Police Brutality 1</w:t>
+      </w:r>
+      <w:r>
+        <w:rPr>
+          <w:rFonts w:ascii="Calibri" w:cs="Calibri" w:eastAsia="Calibri" w:hAnsi="Calibri"/>
+          <w:color w:val="3A4150"/>
+          <w:sz w:val="20"/>
+          <w:szCs w:val="20"/>
+        </w:rPr>
+        <w:t xml:space="preserve">, </w:t>
+      </w:r>
+      <w:r>
+        <w:rPr>
+          <w:rFonts w:ascii="Calibri" w:cs="Calibri" w:eastAsia="Calibri" w:hAnsi="Calibri"/>
+          <w:i/>
+          <w:iCs/>
+          <w:color w:val="3A4150"/>
+          <w:sz w:val="20"/>
+          <w:szCs w:val="20"/>
+        </w:rPr>
+        <w:t xml:space="preserve">Desolation</w:t>
+      </w:r>
+      <w:r>
+        <w:rPr>
+          <w:rFonts w:ascii="Calibri" w:cs="Calibri" w:eastAsia="Calibri" w:hAnsi="Calibri"/>
+          <w:color w:val="3A4150"/>
+          <w:sz w:val="20"/>
+          <w:szCs w:val="20"/>
+        </w:rPr>
+        <w:t xml:space="preserve"> and </w:t>
+      </w:r>
+      <w:r>
+        <w:rPr>
+          <w:rFonts w:ascii="Calibri" w:cs="Calibri" w:eastAsia="Calibri" w:hAnsi="Calibri"/>
+          <w:i/>
+          <w:iCs/>
+          <w:color w:val="3A4150"/>
+          <w:sz w:val="20"/>
+          <w:szCs w:val="20"/>
+        </w:rPr>
+        <w:t xml:space="preserve">The Naira</w:t>
+      </w:r>
+      <w:r>
+        <w:rPr>
+          <w:rFonts w:ascii="Calibri" w:cs="Calibri" w:eastAsia="Calibri" w:hAnsi="Calibri"/>
+          <w:color w:val="3A4150"/>
+          <w:sz w:val="20"/>
+          <w:szCs w:val="20"/>
+        </w:rPr>
+        <w:t xml:space="preserve">.</w:t>
       </w:r>
     </w:p>
     <w:p>
@@ -1134,7 +1155,7 @@
           <w:sz w:val="22"/>
           <w:szCs w:val="22"/>
         </w:rPr>
-        <w:t xml:space="preserve">Outdoor Cooking &amp; Barbecue</w:t>
+        <w:t xml:space="preserve">Content Creator</w:t>
       </w:r>
       <w:r>
         <w:rPr>
@@ -1145,7 +1166,7 @@
           <w:sz w:val="18"/>
           <w:szCs w:val="18"/>
         </w:rPr>
-        <w:t xml:space="preserve">	2018 – 2020</w:t>
+        <w:t xml:space="preserve">	Present</w:t>
       </w:r>
     </w:p>
     <w:p>
@@ -1160,7 +1181,7 @@
           <w:sz w:val="19"/>
           <w:szCs w:val="19"/>
         </w:rPr>
-        <w:t xml:space="preserve">Independent</w:t>
+        <w:t xml:space="preserve">Crypto, finance &amp; trading · X &amp; Instagram</w:t>
       </w:r>
     </w:p>
     <w:p>
@@ -1179,7 +1200,7 @@
           <w:sz w:val="20"/>
           <w:szCs w:val="20"/>
         </w:rPr>
-        <w:t xml:space="preserve">Ran outdoor charcoal barbecue cooking for two years, specialising in chicken and goat meat.</w:t>
+        <w:t xml:space="preserve">Posts thoughts on crypto, finance, trading and prediction markets on X (@i_am_vickyd) and Instagram (@cmv.ng).</w:t>
       </w:r>
     </w:p>
     <w:p>
@@ -1198,6 +1219,90 @@
           <w:sz w:val="20"/>
           <w:szCs w:val="20"/>
         </w:rPr>
+        <w:t xml:space="preserve">Creates content on crypto projects, alongside artwork and new products.</w:t>
+      </w:r>
+    </w:p>
+    <w:p>
+      <w:pPr>
+        <w:keepNext/>
+        <w:tabs>
+          <w:tab w:val="right" w:pos="9890"/>
+        </w:tabs>
+        <w:spacing w:after="0" w:before="140"/>
+      </w:pPr>
+      <w:r>
+        <w:rPr>
+          <w:rFonts w:ascii="Calibri" w:cs="Calibri" w:eastAsia="Calibri" w:hAnsi="Calibri"/>
+          <w:b/>
+          <w:bCs/>
+          <w:color w:val="0E1116"/>
+          <w:sz w:val="22"/>
+          <w:szCs w:val="22"/>
+        </w:rPr>
+        <w:t xml:space="preserve">Outdoor Cooking &amp; Barbecue</w:t>
+      </w:r>
+      <w:r>
+        <w:rPr>
+          <w:rFonts w:ascii="Calibri" w:cs="Calibri" w:eastAsia="Calibri" w:hAnsi="Calibri"/>
+          <w:b/>
+          <w:bCs/>
+          <w:color w:val="6B7383"/>
+          <w:sz w:val="18"/>
+          <w:szCs w:val="18"/>
+        </w:rPr>
+        <w:t xml:space="preserve">	2018 – 2020</w:t>
+      </w:r>
+    </w:p>
+    <w:p>
+      <w:pPr>
+        <w:keepNext/>
+        <w:spacing w:after="60"/>
+      </w:pPr>
+      <w:r>
+        <w:rPr>
+          <w:rFonts w:ascii="Calibri" w:cs="Calibri" w:eastAsia="Calibri" w:hAnsi="Calibri"/>
+          <w:color w:val="2F63E0"/>
+          <w:sz w:val="19"/>
+          <w:szCs w:val="19"/>
+        </w:rPr>
+        <w:t xml:space="preserve">Independent</w:t>
+      </w:r>
+    </w:p>
+    <w:p>
+      <w:pPr>
+        <w:pStyle w:val="ListParagraph"/>
+        <w:numPr>
+          <w:ilvl w:val="0"/>
+          <w:numId w:val="2"/>
+        </w:numPr>
+        <w:spacing w:after="40"/>
+      </w:pPr>
+      <w:r>
+        <w:rPr>
+          <w:rFonts w:ascii="Calibri" w:cs="Calibri" w:eastAsia="Calibri" w:hAnsi="Calibri"/>
+          <w:color w:val="3A4150"/>
+          <w:sz w:val="20"/>
+          <w:szCs w:val="20"/>
+        </w:rPr>
+        <w:t xml:space="preserve">Ran outdoor charcoal barbecue cooking for two years, specialising in chicken and goat meat.</w:t>
+      </w:r>
+    </w:p>
+    <w:p>
+      <w:pPr>
+        <w:pStyle w:val="ListParagraph"/>
+        <w:numPr>
+          <w:ilvl w:val="0"/>
+          <w:numId w:val="2"/>
+        </w:numPr>
+        <w:spacing w:after="40"/>
+      </w:pPr>
+      <w:r>
+        <w:rPr>
+          <w:rFonts w:ascii="Calibri" w:cs="Calibri" w:eastAsia="Calibri" w:hAnsi="Calibri"/>
+          <w:color w:val="3A4150"/>
+          <w:sz w:val="20"/>
+          <w:szCs w:val="20"/>
+        </w:rPr>
         <w:t xml:space="preserve">Handled the full process, from seasoning and marinating the meat to grilling it over charcoal.</w:t>
       </w:r>
     </w:p>
@@ -1290,7 +1395,7 @@
         </w:rPr>
         <w:t xml:space="preserve">cmvng Picks  </w:t>
       </w:r>
-      <w:hyperlink w:history="1" r:id="rIdptwrfqlnzdoxb_nwkc2fq">
+      <w:hyperlink w:history="1" r:id="rIducwzyybfgqbu2ux4-kvb9">
         <w:r>
           <w:rPr>
             <w:rFonts w:ascii="Calibri" w:cs="Calibri" w:eastAsia="Calibri" w:hAnsi="Calibri"/>
@@ -1305,16 +1410,16 @@
     </w:p>
     <w:p>
       <w:pPr>
-        <w:spacing w:after="80"/>
-      </w:pPr>
-      <w:r>
-        <w:rPr>
-          <w:rFonts w:ascii="Calibri" w:cs="Calibri" w:eastAsia="Calibri" w:hAnsi="Calibri"/>
-          <w:color w:val="3A4150"/>
-          <w:sz w:val="20"/>
-          <w:szCs w:val="20"/>
-        </w:rPr>
-        <w:t xml:space="preserve">AI football predictions with daily accumulator slips, one-tap booking codes and a public record of every graded pick.</w:t>
+        <w:spacing w:after="70"/>
+      </w:pPr>
+      <w:r>
+        <w:rPr>
+          <w:rFonts w:ascii="Calibri" w:cs="Calibri" w:eastAsia="Calibri" w:hAnsi="Calibri"/>
+          <w:color w:val="3A4150"/>
+          <w:sz w:val="20"/>
+          <w:szCs w:val="20"/>
+        </w:rPr>
+        <w:t xml:space="preserve">AI football predictions with daily slips, booking codes and a graded public record.</w:t>
       </w:r>
     </w:p>
     <w:p>
@@ -1333,7 +1438,7 @@
         </w:rPr>
         <w:t xml:space="preserve">cmvng Signals  </w:t>
       </w:r>
-      <w:hyperlink w:history="1" r:id="rIdpqyxcwyzhd7rhdrlo5vcy">
+      <w:hyperlink w:history="1" r:id="rIdjsorwj_otiym0pk59xk-a">
         <w:r>
           <w:rPr>
             <w:rFonts w:ascii="Calibri" w:cs="Calibri" w:eastAsia="Calibri" w:hAnsi="Calibri"/>
@@ -1348,16 +1453,16 @@
     </w:p>
     <w:p>
       <w:pPr>
-        <w:spacing w:after="80"/>
-      </w:pPr>
-      <w:r>
-        <w:rPr>
-          <w:rFonts w:ascii="Calibri" w:cs="Calibri" w:eastAsia="Calibri" w:hAnsi="Calibri"/>
-          <w:color w:val="3A4150"/>
-          <w:sz w:val="20"/>
-          <w:szCs w:val="20"/>
-        </w:rPr>
-        <w:t xml:space="preserve">Automated forex and crypto signal bot with entry, stop-loss and take-profit levels and a live results dashboard. Running in paper-trading mode.</w:t>
+        <w:spacing w:after="70"/>
+      </w:pPr>
+      <w:r>
+        <w:rPr>
+          <w:rFonts w:ascii="Calibri" w:cs="Calibri" w:eastAsia="Calibri" w:hAnsi="Calibri"/>
+          <w:color w:val="3A4150"/>
+          <w:sz w:val="20"/>
+          <w:szCs w:val="20"/>
+        </w:rPr>
+        <w:t xml:space="preserve">Automated forex and crypto signal bot with a live results dashboard. Paper trading.</w:t>
       </w:r>
     </w:p>
     <w:p>
@@ -1376,7 +1481,7 @@
         </w:rPr>
         <w:t xml:space="preserve">CMV AlphaScanner  </w:t>
       </w:r>
-      <w:hyperlink w:history="1" r:id="rIdz79tahxslyiae3ejd0v9i">
+      <w:hyperlink w:history="1" r:id="rId0ajeygyl70pyredz4slrs">
         <w:r>
           <w:rPr>
             <w:rFonts w:ascii="Calibri" w:cs="Calibri" w:eastAsia="Calibri" w:hAnsi="Calibri"/>
@@ -1391,16 +1496,16 @@
     </w:p>
     <w:p>
       <w:pPr>
-        <w:spacing w:after="80"/>
-      </w:pPr>
-      <w:r>
-        <w:rPr>
-          <w:rFonts w:ascii="Calibri" w:cs="Calibri" w:eastAsia="Calibri" w:hAnsi="Calibri"/>
-          <w:color w:val="3A4150"/>
-          <w:sz w:val="20"/>
-          <w:szCs w:val="20"/>
-        </w:rPr>
-        <w:t xml:space="preserve">AI red-flag detection across 17 metrics for any crypto project, with an alpha score and a shareable verdict card.</w:t>
+        <w:spacing w:after="70"/>
+      </w:pPr>
+      <w:r>
+        <w:rPr>
+          <w:rFonts w:ascii="Calibri" w:cs="Calibri" w:eastAsia="Calibri" w:hAnsi="Calibri"/>
+          <w:color w:val="3A4150"/>
+          <w:sz w:val="20"/>
+          <w:szCs w:val="20"/>
+        </w:rPr>
+        <w:t xml:space="preserve">AI red-flag detection across 17 metrics for any crypto project, with an alpha score.</w:t>
       </w:r>
     </w:p>
     <w:p>
@@ -1419,7 +1524,7 @@
         </w:rPr>
         <w:t xml:space="preserve">MacroSentinel  </w:t>
       </w:r>
-      <w:hyperlink w:history="1" r:id="rId1q1dd4fagbzbgd7duhu_q">
+      <w:hyperlink w:history="1" r:id="rIdxlpwgjikukscr34sw1lkj">
         <w:r>
           <w:rPr>
             <w:rFonts w:ascii="Calibri" w:cs="Calibri" w:eastAsia="Calibri" w:hAnsi="Calibri"/>
@@ -1434,16 +1539,16 @@
     </w:p>
     <w:p>
       <w:pPr>
-        <w:spacing w:after="80"/>
-      </w:pPr>
-      <w:r>
-        <w:rPr>
-          <w:rFonts w:ascii="Calibri" w:cs="Calibri" w:eastAsia="Calibri" w:hAnsi="Calibri"/>
-          <w:color w:val="3A4150"/>
-          <w:sz w:val="20"/>
-          <w:szCs w:val="20"/>
-        </w:rPr>
-        <w:t xml:space="preserve">Macro sentiment dashboard: a daily macro pulse, a risk-on/risk-off gauge and signals across currencies, commodities and digital assets.</w:t>
+        <w:spacing w:after="70"/>
+      </w:pPr>
+      <w:r>
+        <w:rPr>
+          <w:rFonts w:ascii="Calibri" w:cs="Calibri" w:eastAsia="Calibri" w:hAnsi="Calibri"/>
+          <w:color w:val="3A4150"/>
+          <w:sz w:val="20"/>
+          <w:szCs w:val="20"/>
+        </w:rPr>
+        <w:t xml:space="preserve">Daily macro pulse, risk gauge and signals across currencies, commodities and crypto.</w:t>
       </w:r>
     </w:p>
     <w:p>
@@ -1462,7 +1567,7 @@
         </w:rPr>
         <w:t xml:space="preserve">DCA Simulator  </w:t>
       </w:r>
-      <w:hyperlink w:history="1" r:id="rIdycyg5xk3wmnyjjkxzolqa">
+      <w:hyperlink w:history="1" r:id="rIdxd9qcjrxerda1rjn3ujr0">
         <w:r>
           <w:rPr>
             <w:rFonts w:ascii="Calibri" w:cs="Calibri" w:eastAsia="Calibri" w:hAnsi="Calibri"/>
@@ -1477,7 +1582,7 @@
     </w:p>
     <w:p>
       <w:pPr>
-        <w:spacing w:after="80"/>
+        <w:spacing w:after="70"/>
       </w:pPr>
       <w:r>
         <w:rPr>
@@ -1505,7 +1610,7 @@
         </w:rPr>
         <w:t xml:space="preserve">Bitcoin Battlefield  </w:t>
       </w:r>
-      <w:hyperlink w:history="1" r:id="rId_e9_6ou4dgzcc8qxsuebe">
+      <w:hyperlink w:history="1" r:id="rIdeduuvjgqsghlfpvadg5uw">
         <w:r>
           <w:rPr>
             <w:rFonts w:ascii="Calibri" w:cs="Calibri" w:eastAsia="Calibri" w:hAnsi="Calibri"/>
@@ -1520,7 +1625,7 @@
     </w:p>
     <w:p>
       <w:pPr>
-        <w:spacing w:after="80"/>
+        <w:spacing w:after="70"/>
       </w:pPr>
       <w:r>
         <w:rPr>
@@ -1548,7 +1653,7 @@
         </w:rPr>
         <w:t xml:space="preserve">Banger Studio  </w:t>
       </w:r>
-      <w:hyperlink w:history="1" r:id="rIdqwfqz43ps3-f_dzcmfu8k">
+      <w:hyperlink w:history="1" r:id="rId-ffo9kuvzuapg-njomeij">
         <w:r>
           <w:rPr>
             <w:rFonts w:ascii="Calibri" w:cs="Calibri" w:eastAsia="Calibri" w:hAnsi="Calibri"/>
@@ -1563,16 +1668,16 @@
     </w:p>
     <w:p>
       <w:pPr>
-        <w:spacing w:after="80"/>
-      </w:pPr>
-      <w:r>
-        <w:rPr>
-          <w:rFonts w:ascii="Calibri" w:cs="Calibri" w:eastAsia="Calibri" w:hAnsi="Calibri"/>
-          <w:color w:val="3A4150"/>
-          <w:sz w:val="20"/>
-          <w:szCs w:val="20"/>
-        </w:rPr>
-        <w:t xml:space="preserve">AI content studio with live research, 122 editable templates and a writer that drafts in the user's voice.</w:t>
+        <w:spacing w:after="70"/>
+      </w:pPr>
+      <w:r>
+        <w:rPr>
+          <w:rFonts w:ascii="Calibri" w:cs="Calibri" w:eastAsia="Calibri" w:hAnsi="Calibri"/>
+          <w:color w:val="3A4150"/>
+          <w:sz w:val="20"/>
+          <w:szCs w:val="20"/>
+        </w:rPr>
+        <w:t xml:space="preserve">AI content studio with live research, 122 templates and a voice-matched writer.</w:t>
       </w:r>
     </w:p>
     <w:p>
@@ -1591,7 +1696,7 @@
         </w:rPr>
         <w:t xml:space="preserve">CMVNG Art Gallery  </w:t>
       </w:r>
-      <w:hyperlink w:history="1" r:id="rIdela65w9l7crpfkxljx9ku">
+      <w:hyperlink w:history="1" r:id="rIdojwdtec18vhhvl6dso9rl">
         <w:r>
           <w:rPr>
             <w:rFonts w:ascii="Calibri" w:cs="Calibri" w:eastAsia="Calibri" w:hAnsi="Calibri"/>
@@ -1606,16 +1711,16 @@
     </w:p>
     <w:p>
       <w:pPr>
-        <w:spacing w:after="80"/>
-      </w:pPr>
-      <w:r>
-        <w:rPr>
-          <w:rFonts w:ascii="Calibri" w:cs="Calibri" w:eastAsia="Calibri" w:hAnsi="Calibri"/>
-          <w:color w:val="3A4150"/>
-          <w:sz w:val="20"/>
-          <w:szCs w:val="20"/>
-        </w:rPr>
-        <w:t xml:space="preserve">Online portfolio of 21 drawings and digital works, with a full-screen viewer and a mobile studio for publishing new work.</w:t>
+        <w:spacing w:after="70"/>
+      </w:pPr>
+      <w:r>
+        <w:rPr>
+          <w:rFonts w:ascii="Calibri" w:cs="Calibri" w:eastAsia="Calibri" w:hAnsi="Calibri"/>
+          <w:color w:val="3A4150"/>
+          <w:sz w:val="20"/>
+          <w:szCs w:val="20"/>
+        </w:rPr>
+        <w:t xml:space="preserve">21 drawings and digital works, with a full-screen viewer and a mobile upload studio.</w:t>
       </w:r>
     </w:p>
     <w:p>
@@ -1633,7 +1738,7 @@
         </w:rPr>
         <w:t xml:space="preserve">OpenSea collections  </w:t>
       </w:r>
-      <w:hyperlink w:history="1" r:id="rIdjmdleilt2abhdlcujxznb">
+      <w:hyperlink w:history="1" r:id="rIdyg98cdsqqbr1bjs8nn4nk">
         <w:r>
           <w:rPr>
             <w:rFonts w:ascii="Calibri" w:cs="Calibri" w:eastAsia="Calibri" w:hAnsi="Calibri"/>
@@ -1654,7 +1759,7 @@
         </w:rPr>
         <w:t xml:space="preserve">  ·  </w:t>
       </w:r>
-      <w:hyperlink w:history="1" r:id="rIdd3fe81huhmdaugtp1mwar">
+      <w:hyperlink w:history="1" r:id="rIdkzxdl9balf3z_5etrhhx9">
         <w:r>
           <w:rPr>
             <w:rFonts w:ascii="Calibri" w:cs="Calibri" w:eastAsia="Calibri" w:hAnsi="Calibri"/>
@@ -1810,7 +1915,7 @@
           <w:sz w:val="20"/>
           <w:szCs w:val="20"/>
         </w:rPr>
-        <w:t xml:space="preserve">Forex majors and minors, crypto (Bitcoin), signal automation</w:t>
+        <w:t xml:space="preserve">Forex majors and minors, crypto (Bitcoin), prediction markets, signal automation</w:t>
       </w:r>
     </w:p>
     <w:p>
@@ -1870,7 +1975,7 @@
           <w:sz w:val="20"/>
           <w:szCs w:val="20"/>
         </w:rPr>
-        <w:t xml:space="preserve">Fine art · Financial markets · Bitcoin · AI &amp; automation · Agribusiness · Cars · Content</w:t>
+        <w:t xml:space="preserve">Fine art · Financial markets · Bitcoin · Prediction markets · AI &amp; automation · Agribusiness · Cars · Content</w:t>
       </w:r>
     </w:p>
     <w:p>

</xml_diff>

<commit_message>
Portfolio: design audit fixes, clearer theme switch, contact details
- Fix stale styles: CSS/JS now revalidate on every visit and asset URLs are
  versioned, so returning visitors get the light/dark switch
- Theme control is now a labeled sun/moon switch in the nav, with a
  Light/Dark choice in the phone menu and a footer toggle
- Hero: the 3D spiral fades out behind the name; name sized for desktop
- Phone hero buttons: full-width 3D button, two below
- Contact: email, phone and Telegram (@Cmvceo) cards; Telegram channel kept
- Experience ordered ongoing-first; skills grouped like the CV; 'Seven worlds'
- Footer links, structured data and canonical URL
- CV (web, PDF, Word) and 3D tour contact wall carry the new contact details

Co-Authored-By: Claude Opus 5.5 <noreply@anthropic.com>
Claude-Session: https://claude.ai/code/session_01RQARRjvZbGkqL6S5F9kfaq
</commit_message>
<xml_diff>
--- a/portfolio/cv/Victor-Bukola-Ojumu-CV.docx
+++ b/portfolio/cv/Victor-Bukola-Ojumu-CV.docx
@@ -83,7 +83,45 @@
               </w:rPr>
               <w:t xml:space="preserve">Lagos, Nigeria  ·  </w:t>
             </w:r>
-            <w:hyperlink w:history="1" r:id="rIdassmnh2vwaomtrtvnickf">
+            <w:hyperlink w:history="1" r:id="rIdzoyjdfhkxdyjrxlxd3v2d">
+              <w:r>
+                <w:rPr>
+                  <w:rFonts w:ascii="Calibri" w:cs="Calibri" w:eastAsia="Calibri" w:hAnsi="Calibri"/>
+                  <w:color w:val="2F63E0"/>
+                  <w:sz w:val="19"/>
+                  <w:szCs w:val="19"/>
+                  <w:u w:val="single"/>
+                </w:rPr>
+                <w:t xml:space="preserve">damorazi57@gmail.com</w:t>
+              </w:r>
+            </w:hyperlink>
+            <w:r>
+              <w:rPr>
+                <w:rFonts w:ascii="Calibri" w:cs="Calibri" w:eastAsia="Calibri" w:hAnsi="Calibri"/>
+                <w:color w:val="6B7383"/>
+                <w:sz w:val="19"/>
+                <w:szCs w:val="19"/>
+              </w:rPr>
+              <w:t xml:space="preserve">  ·  </w:t>
+            </w:r>
+            <w:hyperlink w:history="1" r:id="rIddou62w220bq7julxgqcsa">
+              <w:r>
+                <w:rPr>
+                  <w:rFonts w:ascii="Calibri" w:cs="Calibri" w:eastAsia="Calibri" w:hAnsi="Calibri"/>
+                  <w:color w:val="2F63E0"/>
+                  <w:sz w:val="19"/>
+                  <w:szCs w:val="19"/>
+                  <w:u w:val="single"/>
+                </w:rPr>
+                <w:t xml:space="preserve">+234 807 635 6288</w:t>
+              </w:r>
+            </w:hyperlink>
+          </w:p>
+          <w:p>
+            <w:pPr>
+              <w:spacing w:after="20"/>
+            </w:pPr>
+            <w:hyperlink w:history="1" r:id="rId3arku6hfaft0ra067nba5">
               <w:r>
                 <w:rPr>
                   <w:rFonts w:ascii="Calibri" w:cs="Calibri" w:eastAsia="Calibri" w:hAnsi="Calibri"/>
@@ -95,12 +133,42 @@
                 <w:t xml:space="preserve">victor-bukola-ojumu.vercel.app</w:t>
               </w:r>
             </w:hyperlink>
+            <w:r>
+              <w:rPr>
+                <w:rFonts w:ascii="Calibri" w:cs="Calibri" w:eastAsia="Calibri" w:hAnsi="Calibri"/>
+                <w:color w:val="6B7383"/>
+                <w:sz w:val="19"/>
+                <w:szCs w:val="19"/>
+              </w:rPr>
+              <w:t xml:space="preserve">  ·  </w:t>
+            </w:r>
+            <w:r>
+              <w:rPr>
+                <w:rFonts w:ascii="Calibri" w:cs="Calibri" w:eastAsia="Calibri" w:hAnsi="Calibri"/>
+                <w:color w:val="3A4150"/>
+                <w:sz w:val="19"/>
+                <w:szCs w:val="19"/>
+              </w:rPr>
+              <w:t xml:space="preserve">Telegram </w:t>
+            </w:r>
+            <w:hyperlink w:history="1" r:id="rId2j2uikeb0qmmsfxv8okoh">
+              <w:r>
+                <w:rPr>
+                  <w:rFonts w:ascii="Calibri" w:cs="Calibri" w:eastAsia="Calibri" w:hAnsi="Calibri"/>
+                  <w:color w:val="2F63E0"/>
+                  <w:sz w:val="19"/>
+                  <w:szCs w:val="19"/>
+                  <w:u w:val="single"/>
+                </w:rPr>
+                <w:t xml:space="preserve">@Cmvceo</w:t>
+              </w:r>
+            </w:hyperlink>
           </w:p>
           <w:p>
             <w:pPr>
               <w:spacing w:after="0"/>
             </w:pPr>
-            <w:hyperlink w:history="1" r:id="rIdtrxlusl3nwmdyhd5j3gyb">
+            <w:hyperlink w:history="1" r:id="rIdlvn9ztqn8exvntxx-ttil">
               <w:r>
                 <w:rPr>
                   <w:rFonts w:ascii="Calibri" w:cs="Calibri" w:eastAsia="Calibri" w:hAnsi="Calibri"/>
@@ -121,7 +189,7 @@
               </w:rPr>
               <w:t xml:space="preserve">  ·  </w:t>
             </w:r>
-            <w:hyperlink w:history="1" r:id="rIde8thl94pmavntrj-xmgtq">
+            <w:hyperlink w:history="1" r:id="rIdetbkq2sfuczcee5pj-k31">
               <w:r>
                 <w:rPr>
                   <w:rFonts w:ascii="Calibri" w:cs="Calibri" w:eastAsia="Calibri" w:hAnsi="Calibri"/>
@@ -131,27 +199,6 @@
                   <w:u w:val="single"/>
                 </w:rPr>
                 <w:t xml:space="preserve">instagram.com/cmv.ng</w:t>
-              </w:r>
-            </w:hyperlink>
-            <w:r>
-              <w:rPr>
-                <w:rFonts w:ascii="Calibri" w:cs="Calibri" w:eastAsia="Calibri" w:hAnsi="Calibri"/>
-                <w:color w:val="6B7383"/>
-                <w:sz w:val="19"/>
-                <w:szCs w:val="19"/>
-              </w:rPr>
-              <w:t xml:space="preserve">  ·  </w:t>
-            </w:r>
-            <w:hyperlink w:history="1" r:id="rIdntgels4rhf6bdaz6wozar">
-              <w:r>
-                <w:rPr>
-                  <w:rFonts w:ascii="Calibri" w:cs="Calibri" w:eastAsia="Calibri" w:hAnsi="Calibri"/>
-                  <w:color w:val="2F63E0"/>
-                  <w:sz w:val="19"/>
-                  <w:szCs w:val="19"/>
-                  <w:u w:val="single"/>
-                </w:rPr>
-                <w:t xml:space="preserve">t.me/cmv_ng</w:t>
               </w:r>
             </w:hyperlink>
           </w:p>
@@ -636,7 +683,7 @@
         </w:rPr>
         <w:t xml:space="preserve">Represents </w:t>
       </w:r>
-      <w:hyperlink w:history="1" r:id="rId_lvdqlocqed64gucgbmru">
+      <w:hyperlink w:history="1" r:id="rIdplneuayutqfgyeq3japia">
         <w:r>
           <w:rPr>
             <w:rFonts w:ascii="Calibri" w:cs="Calibri" w:eastAsia="Calibri" w:hAnsi="Calibri"/>
@@ -1395,7 +1442,7 @@
         </w:rPr>
         <w:t xml:space="preserve">cmvng Picks  </w:t>
       </w:r>
-      <w:hyperlink w:history="1" r:id="rIducwzyybfgqbu2ux4-kvb9">
+      <w:hyperlink w:history="1" r:id="rIdhg5uulspkw6yhswuapp5s">
         <w:r>
           <w:rPr>
             <w:rFonts w:ascii="Calibri" w:cs="Calibri" w:eastAsia="Calibri" w:hAnsi="Calibri"/>
@@ -1438,7 +1485,7 @@
         </w:rPr>
         <w:t xml:space="preserve">cmvng Signals  </w:t>
       </w:r>
-      <w:hyperlink w:history="1" r:id="rIdjsorwj_otiym0pk59xk-a">
+      <w:hyperlink w:history="1" r:id="rIdxgtn4ekk16sqahael1p-m">
         <w:r>
           <w:rPr>
             <w:rFonts w:ascii="Calibri" w:cs="Calibri" w:eastAsia="Calibri" w:hAnsi="Calibri"/>
@@ -1481,7 +1528,7 @@
         </w:rPr>
         <w:t xml:space="preserve">CMV AlphaScanner  </w:t>
       </w:r>
-      <w:hyperlink w:history="1" r:id="rId0ajeygyl70pyredz4slrs">
+      <w:hyperlink w:history="1" r:id="rIdffu863dobahllw7akue-p">
         <w:r>
           <w:rPr>
             <w:rFonts w:ascii="Calibri" w:cs="Calibri" w:eastAsia="Calibri" w:hAnsi="Calibri"/>
@@ -1524,7 +1571,7 @@
         </w:rPr>
         <w:t xml:space="preserve">MacroSentinel  </w:t>
       </w:r>
-      <w:hyperlink w:history="1" r:id="rIdxlpwgjikukscr34sw1lkj">
+      <w:hyperlink w:history="1" r:id="rIdps5rp-85wfp4oxn5zlpdv">
         <w:r>
           <w:rPr>
             <w:rFonts w:ascii="Calibri" w:cs="Calibri" w:eastAsia="Calibri" w:hAnsi="Calibri"/>
@@ -1567,7 +1614,7 @@
         </w:rPr>
         <w:t xml:space="preserve">DCA Simulator  </w:t>
       </w:r>
-      <w:hyperlink w:history="1" r:id="rIdxd9qcjrxerda1rjn3ujr0">
+      <w:hyperlink w:history="1" r:id="rIdittq02tho2nvk85cesqh7">
         <w:r>
           <w:rPr>
             <w:rFonts w:ascii="Calibri" w:cs="Calibri" w:eastAsia="Calibri" w:hAnsi="Calibri"/>
@@ -1610,7 +1657,7 @@
         </w:rPr>
         <w:t xml:space="preserve">Bitcoin Battlefield  </w:t>
       </w:r>
-      <w:hyperlink w:history="1" r:id="rIdeduuvjgqsghlfpvadg5uw">
+      <w:hyperlink w:history="1" r:id="rIdxnezj9tdqqbtjrizzoy1j">
         <w:r>
           <w:rPr>
             <w:rFonts w:ascii="Calibri" w:cs="Calibri" w:eastAsia="Calibri" w:hAnsi="Calibri"/>
@@ -1653,7 +1700,7 @@
         </w:rPr>
         <w:t xml:space="preserve">Banger Studio  </w:t>
       </w:r>
-      <w:hyperlink w:history="1" r:id="rId-ffo9kuvzuapg-njomeij">
+      <w:hyperlink w:history="1" r:id="rIdy-pe6estwsb_9s6bojmkk">
         <w:r>
           <w:rPr>
             <w:rFonts w:ascii="Calibri" w:cs="Calibri" w:eastAsia="Calibri" w:hAnsi="Calibri"/>
@@ -1696,7 +1743,7 @@
         </w:rPr>
         <w:t xml:space="preserve">CMVNG Art Gallery  </w:t>
       </w:r>
-      <w:hyperlink w:history="1" r:id="rIdojwdtec18vhhvl6dso9rl">
+      <w:hyperlink w:history="1" r:id="rIdl_oqxoiu1n0eg35vjerxa">
         <w:r>
           <w:rPr>
             <w:rFonts w:ascii="Calibri" w:cs="Calibri" w:eastAsia="Calibri" w:hAnsi="Calibri"/>
@@ -1738,7 +1785,7 @@
         </w:rPr>
         <w:t xml:space="preserve">OpenSea collections  </w:t>
       </w:r>
-      <w:hyperlink w:history="1" r:id="rIdyg98cdsqqbr1bjs8nn4nk">
+      <w:hyperlink w:history="1" r:id="rIdbkiryq-s9u8zcupzdjdxi">
         <w:r>
           <w:rPr>
             <w:rFonts w:ascii="Calibri" w:cs="Calibri" w:eastAsia="Calibri" w:hAnsi="Calibri"/>
@@ -1759,7 +1806,7 @@
         </w:rPr>
         <w:t xml:space="preserve">  ·  </w:t>
       </w:r>
-      <w:hyperlink w:history="1" r:id="rIdkzxdl9balf3z_5etrhhx9">
+      <w:hyperlink w:history="1" r:id="rIdhqsa1ipskca971z7gtpkl">
         <w:r>
           <w:rPr>
             <w:rFonts w:ascii="Calibri" w:cs="Calibri" w:eastAsia="Calibri" w:hAnsi="Calibri"/>

</xml_diff>

<commit_message>
Portfolio: add the CMVNG logo, correct the phone number
- Vector cmvng logo (traced from the brand artwork) in the nav mark, footer,
  favicon, 3D tour start screen and entrance wall
- Phone number corrected to +234 807 635 7288 on the site, 3D tour and CV
  (web, PDF, Word)

Co-Authored-By: Claude Opus 5.5 <noreply@anthropic.com>
Claude-Session: https://claude.ai/code/session_01RQARRjvZbGkqL6S5F9kfaq
</commit_message>
<xml_diff>
--- a/portfolio/cv/Victor-Bukola-Ojumu-CV.docx
+++ b/portfolio/cv/Victor-Bukola-Ojumu-CV.docx
@@ -83,7 +83,7 @@
               </w:rPr>
               <w:t xml:space="preserve">Lagos, Nigeria  ·  </w:t>
             </w:r>
-            <w:hyperlink w:history="1" r:id="rIdzoyjdfhkxdyjrxlxd3v2d">
+            <w:hyperlink w:history="1" r:id="rIdwywxa9jcfhktxuakqq1zy">
               <w:r>
                 <w:rPr>
                   <w:rFonts w:ascii="Calibri" w:cs="Calibri" w:eastAsia="Calibri" w:hAnsi="Calibri"/>
@@ -104,7 +104,7 @@
               </w:rPr>
               <w:t xml:space="preserve">  ·  </w:t>
             </w:r>
-            <w:hyperlink w:history="1" r:id="rIddou62w220bq7julxgqcsa">
+            <w:hyperlink w:history="1" r:id="rIdzkzgvtjibq7pku1e4cozr">
               <w:r>
                 <w:rPr>
                   <w:rFonts w:ascii="Calibri" w:cs="Calibri" w:eastAsia="Calibri" w:hAnsi="Calibri"/>
@@ -113,7 +113,7 @@
                   <w:szCs w:val="19"/>
                   <w:u w:val="single"/>
                 </w:rPr>
-                <w:t xml:space="preserve">+234 807 635 6288</w:t>
+                <w:t xml:space="preserve">+234 807 635 7288</w:t>
               </w:r>
             </w:hyperlink>
           </w:p>
@@ -121,7 +121,7 @@
             <w:pPr>
               <w:spacing w:after="20"/>
             </w:pPr>
-            <w:hyperlink w:history="1" r:id="rId3arku6hfaft0ra067nba5">
+            <w:hyperlink w:history="1" r:id="rIdad1mbpsf7ucibxon8pz9b">
               <w:r>
                 <w:rPr>
                   <w:rFonts w:ascii="Calibri" w:cs="Calibri" w:eastAsia="Calibri" w:hAnsi="Calibri"/>
@@ -151,7 +151,7 @@
               </w:rPr>
               <w:t xml:space="preserve">Telegram </w:t>
             </w:r>
-            <w:hyperlink w:history="1" r:id="rId2j2uikeb0qmmsfxv8okoh">
+            <w:hyperlink w:history="1" r:id="rIdscaqh5kiwmssnkotr8ab2">
               <w:r>
                 <w:rPr>
                   <w:rFonts w:ascii="Calibri" w:cs="Calibri" w:eastAsia="Calibri" w:hAnsi="Calibri"/>
@@ -168,7 +168,7 @@
             <w:pPr>
               <w:spacing w:after="0"/>
             </w:pPr>
-            <w:hyperlink w:history="1" r:id="rIdlvn9ztqn8exvntxx-ttil">
+            <w:hyperlink w:history="1" r:id="rId5abews-98moyrh2m3r-u6">
               <w:r>
                 <w:rPr>
                   <w:rFonts w:ascii="Calibri" w:cs="Calibri" w:eastAsia="Calibri" w:hAnsi="Calibri"/>
@@ -189,7 +189,7 @@
               </w:rPr>
               <w:t xml:space="preserve">  ·  </w:t>
             </w:r>
-            <w:hyperlink w:history="1" r:id="rIdetbkq2sfuczcee5pj-k31">
+            <w:hyperlink w:history="1" r:id="rIdm6fozxsubb3usxzbbm4ml">
               <w:r>
                 <w:rPr>
                   <w:rFonts w:ascii="Calibri" w:cs="Calibri" w:eastAsia="Calibri" w:hAnsi="Calibri"/>
@@ -683,7 +683,7 @@
         </w:rPr>
         <w:t xml:space="preserve">Represents </w:t>
       </w:r>
-      <w:hyperlink w:history="1" r:id="rIdplneuayutqfgyeq3japia">
+      <w:hyperlink w:history="1" r:id="rIdvgm9hoilewevydffeweis">
         <w:r>
           <w:rPr>
             <w:rFonts w:ascii="Calibri" w:cs="Calibri" w:eastAsia="Calibri" w:hAnsi="Calibri"/>
@@ -1442,7 +1442,7 @@
         </w:rPr>
         <w:t xml:space="preserve">cmvng Picks  </w:t>
       </w:r>
-      <w:hyperlink w:history="1" r:id="rIdhg5uulspkw6yhswuapp5s">
+      <w:hyperlink w:history="1" r:id="rIdm0mxkl56iod7tjjp7kq04">
         <w:r>
           <w:rPr>
             <w:rFonts w:ascii="Calibri" w:cs="Calibri" w:eastAsia="Calibri" w:hAnsi="Calibri"/>
@@ -1485,7 +1485,7 @@
         </w:rPr>
         <w:t xml:space="preserve">cmvng Signals  </w:t>
       </w:r>
-      <w:hyperlink w:history="1" r:id="rIdxgtn4ekk16sqahael1p-m">
+      <w:hyperlink w:history="1" r:id="rId6zykdzuuwz9t6_wpfdrhm">
         <w:r>
           <w:rPr>
             <w:rFonts w:ascii="Calibri" w:cs="Calibri" w:eastAsia="Calibri" w:hAnsi="Calibri"/>
@@ -1528,7 +1528,7 @@
         </w:rPr>
         <w:t xml:space="preserve">CMV AlphaScanner  </w:t>
       </w:r>
-      <w:hyperlink w:history="1" r:id="rIdffu863dobahllw7akue-p">
+      <w:hyperlink w:history="1" r:id="rIdzjdkxhbolgbw8rkyhgvur">
         <w:r>
           <w:rPr>
             <w:rFonts w:ascii="Calibri" w:cs="Calibri" w:eastAsia="Calibri" w:hAnsi="Calibri"/>
@@ -1571,7 +1571,7 @@
         </w:rPr>
         <w:t xml:space="preserve">MacroSentinel  </w:t>
       </w:r>
-      <w:hyperlink w:history="1" r:id="rIdps5rp-85wfp4oxn5zlpdv">
+      <w:hyperlink w:history="1" r:id="rIdx6jt_kzm159jhmkywxz1x">
         <w:r>
           <w:rPr>
             <w:rFonts w:ascii="Calibri" w:cs="Calibri" w:eastAsia="Calibri" w:hAnsi="Calibri"/>
@@ -1614,7 +1614,7 @@
         </w:rPr>
         <w:t xml:space="preserve">DCA Simulator  </w:t>
       </w:r>
-      <w:hyperlink w:history="1" r:id="rIdittq02tho2nvk85cesqh7">
+      <w:hyperlink w:history="1" r:id="rIdnnsanixcsvkwlc5jp7dci">
         <w:r>
           <w:rPr>
             <w:rFonts w:ascii="Calibri" w:cs="Calibri" w:eastAsia="Calibri" w:hAnsi="Calibri"/>
@@ -1657,7 +1657,7 @@
         </w:rPr>
         <w:t xml:space="preserve">Bitcoin Battlefield  </w:t>
       </w:r>
-      <w:hyperlink w:history="1" r:id="rIdxnezj9tdqqbtjrizzoy1j">
+      <w:hyperlink w:history="1" r:id="rIdkv7o-pwdiwk8ypeac1hx-">
         <w:r>
           <w:rPr>
             <w:rFonts w:ascii="Calibri" w:cs="Calibri" w:eastAsia="Calibri" w:hAnsi="Calibri"/>
@@ -1700,7 +1700,7 @@
         </w:rPr>
         <w:t xml:space="preserve">Banger Studio  </w:t>
       </w:r>
-      <w:hyperlink w:history="1" r:id="rIdy-pe6estwsb_9s6bojmkk">
+      <w:hyperlink w:history="1" r:id="rIdzzdwhygyi3gxtq70pewnk">
         <w:r>
           <w:rPr>
             <w:rFonts w:ascii="Calibri" w:cs="Calibri" w:eastAsia="Calibri" w:hAnsi="Calibri"/>
@@ -1743,7 +1743,7 @@
         </w:rPr>
         <w:t xml:space="preserve">CMVNG Art Gallery  </w:t>
       </w:r>
-      <w:hyperlink w:history="1" r:id="rIdl_oqxoiu1n0eg35vjerxa">
+      <w:hyperlink w:history="1" r:id="rId8sru4q5gkfadenwr3yodd">
         <w:r>
           <w:rPr>
             <w:rFonts w:ascii="Calibri" w:cs="Calibri" w:eastAsia="Calibri" w:hAnsi="Calibri"/>
@@ -1785,7 +1785,7 @@
         </w:rPr>
         <w:t xml:space="preserve">OpenSea collections  </w:t>
       </w:r>
-      <w:hyperlink w:history="1" r:id="rIdbkiryq-s9u8zcupzdjdxi">
+      <w:hyperlink w:history="1" r:id="rIdheo-majtzn5vxubte7lfh">
         <w:r>
           <w:rPr>
             <w:rFonts w:ascii="Calibri" w:cs="Calibri" w:eastAsia="Calibri" w:hAnsi="Calibri"/>
@@ -1806,7 +1806,7 @@
         </w:rPr>
         <w:t xml:space="preserve">  ·  </w:t>
       </w:r>
-      <w:hyperlink w:history="1" r:id="rIdhqsa1ipskca971z7gtpkl">
+      <w:hyperlink w:history="1" r:id="rIdlgoioliggbjcxzfeetzgd">
         <w:r>
           <w:rPr>
             <w:rFonts w:ascii="Calibri" w:cs="Calibri" w:eastAsia="Calibri" w:hAnsi="Calibri"/>

</xml_diff>